<commit_message>
docs: update Arcadia Premium business requirements document
</commit_message>
<xml_diff>
--- a/Arcadia_Premium_BRD.docx
+++ b/Arcadia_Premium_BRD.docx
@@ -14,7 +14,23 @@
           <w:b/>
           <w:bCs/>
         </w:rPr>
-        <w:t>Requirements Document: ArcadiaPremium Real Estate Management Platform</w:t>
+        <w:t xml:space="preserve">Requirements Document: </w:t>
+      </w:r>
+      <w:proofErr w:type="spellStart"/>
+      <w:r>
+        <w:rPr>
+          <w:b/>
+          <w:bCs/>
+        </w:rPr>
+        <w:t>ArcadiaPremium</w:t>
+      </w:r>
+      <w:proofErr w:type="spellEnd"/>
+      <w:r>
+        <w:rPr>
+          <w:b/>
+          <w:bCs/>
+        </w:rPr>
+        <w:t xml:space="preserve"> Real Estate Management Platform</w:t>
       </w:r>
     </w:p>
     <w:p>
@@ -33,14 +49,19 @@
       </w:r>
     </w:p>
     <w:p>
-      <w:r>
-        <w:t>ArcadiaPremium is a comprehensive real-time real estate management platform designed to streamline operations from sales and customer acquisition to field attendance and financial tracking. The system integrates a React-based frontend with a Spring Boot backend, utilizing PostgreSQL for robust data persistence and multi-level approval workflows for operational integrity.</w:t>
+      <w:proofErr w:type="spellStart"/>
+      <w:r>
+        <w:t>ArcadiaPremium</w:t>
+      </w:r>
+      <w:proofErr w:type="spellEnd"/>
+      <w:r>
+        <w:t xml:space="preserve"> is a comprehensive real-time real estate management platform designed to streamline operations from sales and customer acquisition to field attendance and financial tracking. The system integrates a React-based frontend with a Spring Boot backend, utilizing PostgreSQL for robust data persistence and multi-level approval workflows for operational integrity.</w:t>
       </w:r>
     </w:p>
     <w:p>
       <w:r>
         <w:pict w14:anchorId="430ED730">
-          <v:rect id="_x0000_i1100" style="width:9in;height:.75pt" o:hrpct="0" o:hralign="center" o:hrstd="t" o:hr="t" fillcolor="#a0a0a0" stroked="f"/>
+          <v:rect id="_x0000_i1025" style="width:9in;height:.75pt" o:hrpct="0" o:hralign="center" o:hrstd="t" o:hr="t" fillcolor="#a0a0a0" stroked="f"/>
         </w:pict>
       </w:r>
     </w:p>
@@ -175,7 +196,7 @@
     <w:p>
       <w:r>
         <w:pict w14:anchorId="2B62277A">
-          <v:rect id="_x0000_i1101" style="width:9in;height:.75pt" o:hrpct="0" o:hralign="center" o:hrstd="t" o:hr="t" fillcolor="#a0a0a0" stroked="f"/>
+          <v:rect id="_x0000_i1026" style="width:9in;height:.75pt" o:hrpct="0" o:hralign="center" o:hrstd="t" o:hr="t" fillcolor="#a0a0a0" stroked="f"/>
         </w:pict>
       </w:r>
     </w:p>
@@ -328,7 +349,15 @@
         <w:t>Role Assignment</w:t>
       </w:r>
       <w:r>
-        <w:t>: Assign multiple roles to a single user for granular permissioning.</w:t>
+        <w:t xml:space="preserve">: Assign multiple roles to a single user for granular </w:t>
+      </w:r>
+      <w:proofErr w:type="spellStart"/>
+      <w:r>
+        <w:t>permissioning</w:t>
+      </w:r>
+      <w:proofErr w:type="spellEnd"/>
+      <w:r>
+        <w:t>.</w:t>
       </w:r>
     </w:p>
     <w:p>
@@ -450,7 +479,23 @@
         </w:numPr>
       </w:pPr>
       <w:r>
-        <w:t>Calculate pricing based on Land Extent (SqYards), SFT per SqYard, and Base Price per SFT.</w:t>
+        <w:t>Calculate pricing based on Land Extent (</w:t>
+      </w:r>
+      <w:proofErr w:type="spellStart"/>
+      <w:r>
+        <w:t>SqYards</w:t>
+      </w:r>
+      <w:proofErr w:type="spellEnd"/>
+      <w:r>
+        <w:t xml:space="preserve">), SFT per </w:t>
+      </w:r>
+      <w:proofErr w:type="spellStart"/>
+      <w:r>
+        <w:t>SqYard</w:t>
+      </w:r>
+      <w:proofErr w:type="spellEnd"/>
+      <w:r>
+        <w:t>, and Base Price per SFT.</w:t>
       </w:r>
     </w:p>
     <w:p>
@@ -812,7 +857,15 @@
         <w:t>Plot Filtering</w:t>
       </w:r>
       <w:r>
-        <w:t>: Filter or color-code plots based on size categories (e.g., 180, 200, 250+ SqYards).</w:t>
+        <w:t xml:space="preserve">: Filter or color-code plots based on size categories (e.g., 180, 200, 250+ </w:t>
+      </w:r>
+      <w:proofErr w:type="spellStart"/>
+      <w:r>
+        <w:t>SqYards</w:t>
+      </w:r>
+      <w:proofErr w:type="spellEnd"/>
+      <w:r>
+        <w:t>).</w:t>
       </w:r>
     </w:p>
     <w:p>
@@ -845,6 +898,7 @@
           <w:numId w:val="21"/>
         </w:numPr>
       </w:pPr>
+      <w:proofErr w:type="gramStart"/>
       <w:r>
         <w:rPr>
           <w:b/>
@@ -852,6 +906,7 @@
         </w:rPr>
         <w:t>Chain Definition</w:t>
       </w:r>
+      <w:proofErr w:type="gramEnd"/>
       <w:r>
         <w:t>: Define custom approval workflows for different activities.</w:t>
       </w:r>
@@ -877,7 +932,7 @@
     <w:p>
       <w:r>
         <w:pict w14:anchorId="6F914165">
-          <v:rect id="_x0000_i1102" style="width:9in;height:.75pt" o:hrpct="0" o:hralign="center" o:hrstd="t" o:hr="t" fillcolor="#a0a0a0" stroked="f"/>
+          <v:rect id="_x0000_i1027" style="width:9in;height:.75pt" o:hrpct="0" o:hralign="center" o:hrstd="t" o:hr="t" fillcolor="#a0a0a0" stroked="f"/>
         </w:pict>
       </w:r>
     </w:p>
@@ -1001,8 +1056,13 @@
           </w:tcPr>
           <w:p>
             <w:r>
-              <w:t>email, password, roles (List), activeStatus</w:t>
+              <w:t xml:space="preserve">email, password, roles (List), </w:t>
             </w:r>
+            <w:proofErr w:type="spellStart"/>
+            <w:r>
+              <w:t>activeStatus</w:t>
+            </w:r>
+            <w:proofErr w:type="spellEnd"/>
           </w:p>
         </w:tc>
       </w:tr>
@@ -1046,7 +1106,185 @@
           </w:tcPr>
           <w:p>
             <w:r>
-              <w:t>name, description, activeStatus</w:t>
+              <w:t xml:space="preserve">name, description, </w:t>
+            </w:r>
+            <w:proofErr w:type="spellStart"/>
+            <w:r>
+              <w:t>activeStatus</w:t>
+            </w:r>
+            <w:proofErr w:type="spellEnd"/>
+          </w:p>
+        </w:tc>
+      </w:tr>
+      <w:tr>
+        <w:trPr>
+          <w:tblCellSpacing w:w="15" w:type="dxa"/>
+        </w:trPr>
+        <w:tc>
+          <w:tcPr>
+            <w:tcW w:w="0" w:type="auto"/>
+            <w:tcBorders>
+              <w:top w:val="single" w:sz="6" w:space="0" w:color="auto"/>
+              <w:left w:val="single" w:sz="2" w:space="0" w:color="auto"/>
+              <w:bottom w:val="single" w:sz="6" w:space="0" w:color="auto"/>
+              <w:right w:val="single" w:sz="6" w:space="0" w:color="auto"/>
+            </w:tcBorders>
+            <w:vAlign w:val="center"/>
+            <w:hideMark/>
+          </w:tcPr>
+          <w:p>
+            <w:proofErr w:type="spellStart"/>
+            <w:r>
+              <w:rPr>
+                <w:b/>
+                <w:bCs/>
+              </w:rPr>
+              <w:t>SaleEntry</w:t>
+            </w:r>
+            <w:proofErr w:type="spellEnd"/>
+          </w:p>
+        </w:tc>
+        <w:tc>
+          <w:tcPr>
+            <w:tcW w:w="0" w:type="auto"/>
+            <w:tcBorders>
+              <w:top w:val="single" w:sz="6" w:space="0" w:color="auto"/>
+              <w:left w:val="single" w:sz="6" w:space="0" w:color="auto"/>
+              <w:bottom w:val="single" w:sz="6" w:space="0" w:color="auto"/>
+              <w:right w:val="single" w:sz="2" w:space="0" w:color="auto"/>
+            </w:tcBorders>
+            <w:vAlign w:val="center"/>
+            <w:hideMark/>
+          </w:tcPr>
+          <w:p>
+            <w:proofErr w:type="spellStart"/>
+            <w:r>
+              <w:t>customerName</w:t>
+            </w:r>
+            <w:proofErr w:type="spellEnd"/>
+            <w:r>
+              <w:t xml:space="preserve">, </w:t>
+            </w:r>
+            <w:proofErr w:type="spellStart"/>
+            <w:r>
+              <w:t>villaNo</w:t>
+            </w:r>
+            <w:proofErr w:type="spellEnd"/>
+            <w:r>
+              <w:t xml:space="preserve">, </w:t>
+            </w:r>
+            <w:proofErr w:type="spellStart"/>
+            <w:r>
+              <w:t>sbuaSft</w:t>
+            </w:r>
+            <w:proofErr w:type="spellEnd"/>
+            <w:r>
+              <w:t xml:space="preserve">, </w:t>
+            </w:r>
+            <w:proofErr w:type="spellStart"/>
+            <w:r>
+              <w:t>grandTotal</w:t>
+            </w:r>
+            <w:proofErr w:type="spellEnd"/>
+            <w:r>
+              <w:t xml:space="preserve">, </w:t>
+            </w:r>
+            <w:proofErr w:type="spellStart"/>
+            <w:r>
+              <w:t>balanceToReceive</w:t>
+            </w:r>
+            <w:proofErr w:type="spellEnd"/>
+          </w:p>
+        </w:tc>
+      </w:tr>
+      <w:tr>
+        <w:trPr>
+          <w:tblCellSpacing w:w="15" w:type="dxa"/>
+        </w:trPr>
+        <w:tc>
+          <w:tcPr>
+            <w:tcW w:w="0" w:type="auto"/>
+            <w:tcBorders>
+              <w:top w:val="single" w:sz="6" w:space="0" w:color="auto"/>
+              <w:left w:val="single" w:sz="2" w:space="0" w:color="auto"/>
+              <w:bottom w:val="single" w:sz="6" w:space="0" w:color="auto"/>
+              <w:right w:val="single" w:sz="6" w:space="0" w:color="auto"/>
+            </w:tcBorders>
+            <w:vAlign w:val="center"/>
+            <w:hideMark/>
+          </w:tcPr>
+          <w:p>
+            <w:proofErr w:type="spellStart"/>
+            <w:r>
+              <w:rPr>
+                <w:b/>
+                <w:bCs/>
+              </w:rPr>
+              <w:t>SiteAttendance</w:t>
+            </w:r>
+            <w:proofErr w:type="spellEnd"/>
+          </w:p>
+        </w:tc>
+        <w:tc>
+          <w:tcPr>
+            <w:tcW w:w="0" w:type="auto"/>
+            <w:tcBorders>
+              <w:top w:val="single" w:sz="6" w:space="0" w:color="auto"/>
+              <w:left w:val="single" w:sz="6" w:space="0" w:color="auto"/>
+              <w:bottom w:val="single" w:sz="6" w:space="0" w:color="auto"/>
+              <w:right w:val="single" w:sz="2" w:space="0" w:color="auto"/>
+            </w:tcBorders>
+            <w:vAlign w:val="center"/>
+            <w:hideMark/>
+          </w:tcPr>
+          <w:p>
+            <w:proofErr w:type="spellStart"/>
+            <w:r>
+              <w:t>attendanceDate</w:t>
+            </w:r>
+            <w:proofErr w:type="spellEnd"/>
+            <w:r>
+              <w:t xml:space="preserve">, </w:t>
+            </w:r>
+            <w:proofErr w:type="spellStart"/>
+            <w:r>
+              <w:t>siteName</w:t>
+            </w:r>
+            <w:proofErr w:type="spellEnd"/>
+            <w:r>
+              <w:t xml:space="preserve">, imageBase64, </w:t>
+            </w:r>
+            <w:proofErr w:type="spellStart"/>
+            <w:r>
+              <w:t>maleMastri</w:t>
+            </w:r>
+            <w:proofErr w:type="spellEnd"/>
+            <w:r>
+              <w:t xml:space="preserve">, </w:t>
+            </w:r>
+            <w:proofErr w:type="spellStart"/>
+            <w:r>
+              <w:t>femaleMastri</w:t>
+            </w:r>
+            <w:proofErr w:type="spellEnd"/>
+            <w:r>
+              <w:t xml:space="preserve">, </w:t>
+            </w:r>
+            <w:proofErr w:type="spellStart"/>
+            <w:r>
+              <w:t>maleHelper</w:t>
+            </w:r>
+            <w:proofErr w:type="spellEnd"/>
+            <w:r>
+              <w:t xml:space="preserve">, </w:t>
+            </w:r>
+            <w:proofErr w:type="spellStart"/>
+            <w:r>
+              <w:t>femaleHelper</w:t>
+            </w:r>
+            <w:proofErr w:type="spellEnd"/>
+            <w:r>
+              <w:t>, status</w:t>
             </w:r>
           </w:p>
         </w:tc>
@@ -1068,13 +1306,15 @@
             <w:hideMark/>
           </w:tcPr>
           <w:p>
+            <w:proofErr w:type="spellStart"/>
             <w:r>
               <w:rPr>
                 <w:b/>
                 <w:bCs/>
               </w:rPr>
-              <w:t>SaleEntry</w:t>
+              <w:t>ApprovalChain</w:t>
             </w:r>
+            <w:proofErr w:type="spellEnd"/>
           </w:p>
         </w:tc>
         <w:tc>
@@ -1091,97 +1331,15 @@
           </w:tcPr>
           <w:p>
             <w:r>
-              <w:t>customerName, villaNo, sbuaSft, grandTotal, balanceToReceive</w:t>
+              <w:t xml:space="preserve">name, steps (List of </w:t>
             </w:r>
-          </w:p>
-        </w:tc>
-      </w:tr>
-      <w:tr>
-        <w:trPr>
-          <w:tblCellSpacing w:w="15" w:type="dxa"/>
-        </w:trPr>
-        <w:tc>
-          <w:tcPr>
-            <w:tcW w:w="0" w:type="auto"/>
-            <w:tcBorders>
-              <w:top w:val="single" w:sz="6" w:space="0" w:color="auto"/>
-              <w:left w:val="single" w:sz="2" w:space="0" w:color="auto"/>
-              <w:bottom w:val="single" w:sz="6" w:space="0" w:color="auto"/>
-              <w:right w:val="single" w:sz="6" w:space="0" w:color="auto"/>
-            </w:tcBorders>
-            <w:vAlign w:val="center"/>
-            <w:hideMark/>
-          </w:tcPr>
-          <w:p>
+            <w:proofErr w:type="spellStart"/>
             <w:r>
-              <w:rPr>
-                <w:b/>
-                <w:bCs/>
-              </w:rPr>
-              <w:t>SiteAttendance</w:t>
+              <w:t>ApprovalChainStep</w:t>
             </w:r>
-          </w:p>
-        </w:tc>
-        <w:tc>
-          <w:tcPr>
-            <w:tcW w:w="0" w:type="auto"/>
-            <w:tcBorders>
-              <w:top w:val="single" w:sz="6" w:space="0" w:color="auto"/>
-              <w:left w:val="single" w:sz="6" w:space="0" w:color="auto"/>
-              <w:bottom w:val="single" w:sz="6" w:space="0" w:color="auto"/>
-              <w:right w:val="single" w:sz="2" w:space="0" w:color="auto"/>
-            </w:tcBorders>
-            <w:vAlign w:val="center"/>
-            <w:hideMark/>
-          </w:tcPr>
-          <w:p>
+            <w:proofErr w:type="spellEnd"/>
             <w:r>
-              <w:t>attendanceDate, siteName, imageBase64, maleMastri, femaleMastri, maleHelper, femaleHelper, status</w:t>
-            </w:r>
-          </w:p>
-        </w:tc>
-      </w:tr>
-      <w:tr>
-        <w:trPr>
-          <w:tblCellSpacing w:w="15" w:type="dxa"/>
-        </w:trPr>
-        <w:tc>
-          <w:tcPr>
-            <w:tcW w:w="0" w:type="auto"/>
-            <w:tcBorders>
-              <w:top w:val="single" w:sz="6" w:space="0" w:color="auto"/>
-              <w:left w:val="single" w:sz="2" w:space="0" w:color="auto"/>
-              <w:bottom w:val="single" w:sz="6" w:space="0" w:color="auto"/>
-              <w:right w:val="single" w:sz="6" w:space="0" w:color="auto"/>
-            </w:tcBorders>
-            <w:vAlign w:val="center"/>
-            <w:hideMark/>
-          </w:tcPr>
-          <w:p>
-            <w:r>
-              <w:rPr>
-                <w:b/>
-                <w:bCs/>
-              </w:rPr>
-              <w:t>ApprovalChain</w:t>
-            </w:r>
-          </w:p>
-        </w:tc>
-        <w:tc>
-          <w:tcPr>
-            <w:tcW w:w="0" w:type="auto"/>
-            <w:tcBorders>
-              <w:top w:val="single" w:sz="6" w:space="0" w:color="auto"/>
-              <w:left w:val="single" w:sz="6" w:space="0" w:color="auto"/>
-              <w:bottom w:val="single" w:sz="6" w:space="0" w:color="auto"/>
-              <w:right w:val="single" w:sz="2" w:space="0" w:color="auto"/>
-            </w:tcBorders>
-            <w:vAlign w:val="center"/>
-            <w:hideMark/>
-          </w:tcPr>
-          <w:p>
-            <w:r>
-              <w:t>name, steps (List of ApprovalChainStep)</w:t>
+              <w:t>)</w:t>
             </w:r>
           </w:p>
         </w:tc>
@@ -1203,6 +1361,7 @@
             <w:hideMark/>
           </w:tcPr>
           <w:p>
+            <w:proofErr w:type="spellStart"/>
             <w:r>
               <w:rPr>
                 <w:b/>
@@ -1210,6 +1369,7 @@
               </w:rPr>
               <w:t>ApprovalStep</w:t>
             </w:r>
+            <w:proofErr w:type="spellEnd"/>
           </w:p>
         </w:tc>
         <w:tc>
@@ -1235,7 +1395,7 @@
     <w:p>
       <w:r>
         <w:pict w14:anchorId="3286A3DF">
-          <v:rect id="_x0000_i1103" style="width:9in;height:.75pt" o:hrpct="0" o:hralign="center" o:hrstd="t" o:hr="t" fillcolor="#a0a0a0" stroked="f"/>
+          <v:rect id="_x0000_i1028" style="width:9in;height:.75pt" o:hrpct="0" o:hralign="center" o:hrstd="t" o:hr="t" fillcolor="#a0a0a0" stroked="f"/>
         </w:pict>
       </w:r>
     </w:p>
@@ -1644,7 +1804,7 @@
     <w:p>
       <w:r>
         <w:pict w14:anchorId="7249764E">
-          <v:rect id="_x0000_i1104" style="width:9in;height:.75pt" o:hrpct="0" o:hralign="center" o:hrstd="t" o:hr="t" fillcolor="#a0a0a0" stroked="f"/>
+          <v:rect id="_x0000_i1029" style="width:9in;height:.75pt" o:hrpct="0" o:hralign="center" o:hrstd="t" o:hr="t" fillcolor="#a0a0a0" stroked="f"/>
         </w:pict>
       </w:r>
     </w:p>
@@ -1714,7 +1874,15 @@
         <w:t>Reliability</w:t>
       </w:r>
       <w:r>
-        <w:t>: All financial calculations must be handled using high-precision data types (BigDecimal).</w:t>
+        <w:t>: All financial calculations must be handled using high-precision data types (</w:t>
+      </w:r>
+      <w:proofErr w:type="spellStart"/>
+      <w:r>
+        <w:t>BigDecimal</w:t>
+      </w:r>
+      <w:proofErr w:type="spellEnd"/>
+      <w:r>
+        <w:t>).</w:t>
       </w:r>
     </w:p>
     <w:p>
@@ -1723,6 +1891,9 @@
           <w:ilvl w:val="0"/>
           <w:numId w:val="28"/>
         </w:numPr>
+        <w:pBdr>
+          <w:bottom w:val="single" w:sz="6" w:space="1" w:color="auto"/>
+        </w:pBdr>
       </w:pPr>
       <w:r>
         <w:rPr>
@@ -1733,6 +1904,527 @@
       </w:r>
       <w:r>
         <w:t>: Responsive design for field operations on tablets/mobile devices.</w:t>
+      </w:r>
+    </w:p>
+    <w:p>
+      <w:pPr>
+        <w:rPr>
+          <w:b/>
+          <w:bCs/>
+        </w:rPr>
+      </w:pPr>
+      <w:r>
+        <w:br w:type="page"/>
+      </w:r>
+      <w:r>
+        <w:rPr>
+          <w:b/>
+          <w:bCs/>
+        </w:rPr>
+        <w:lastRenderedPageBreak/>
+        <w:t>Phase 2: Collaborative Intelligence &amp; Enterprise Scaling</w:t>
+      </w:r>
+    </w:p>
+    <w:p>
+      <w:pPr>
+        <w:rPr>
+          <w:b/>
+          <w:bCs/>
+        </w:rPr>
+      </w:pPr>
+      <w:r>
+        <w:rPr>
+          <w:b/>
+          <w:bCs/>
+        </w:rPr>
+        <w:t>1. Advanced Document Management (DMS+)</w:t>
+      </w:r>
+    </w:p>
+    <w:p>
+      <w:pPr>
+        <w:numPr>
+          <w:ilvl w:val="0"/>
+          <w:numId w:val="33"/>
+        </w:numPr>
+      </w:pPr>
+      <w:r>
+        <w:rPr>
+          <w:b/>
+          <w:bCs/>
+        </w:rPr>
+        <w:t>Version Control</w:t>
+      </w:r>
+      <w:r>
+        <w:t>: Ability to track changes to documents with "Rollback" capabilities to previous versions.</w:t>
+      </w:r>
+    </w:p>
+    <w:p>
+      <w:pPr>
+        <w:numPr>
+          <w:ilvl w:val="0"/>
+          <w:numId w:val="33"/>
+        </w:numPr>
+      </w:pPr>
+      <w:r>
+        <w:rPr>
+          <w:b/>
+          <w:bCs/>
+        </w:rPr>
+        <w:t>Full-Text Search</w:t>
+      </w:r>
+      <w:r>
+        <w:t>: Implement an indexing service (e.g., Elasticsearch) to allow users to search </w:t>
+      </w:r>
+      <w:r>
+        <w:rPr>
+          <w:i/>
+          <w:iCs/>
+        </w:rPr>
+        <w:t>inside</w:t>
+      </w:r>
+      <w:r>
+        <w:t> uploaded PDF and Word documents.</w:t>
+      </w:r>
+    </w:p>
+    <w:p>
+      <w:pPr>
+        <w:numPr>
+          <w:ilvl w:val="0"/>
+          <w:numId w:val="33"/>
+        </w:numPr>
+      </w:pPr>
+      <w:r>
+        <w:rPr>
+          <w:b/>
+          <w:bCs/>
+        </w:rPr>
+        <w:t>In-App Annotations</w:t>
+      </w:r>
+      <w:r>
+        <w:t>: Enable users to add comments or "sticky notes" directly onto documents without downloading them.</w:t>
+      </w:r>
+    </w:p>
+    <w:p>
+      <w:pPr>
+        <w:numPr>
+          <w:ilvl w:val="0"/>
+          <w:numId w:val="33"/>
+        </w:numPr>
+      </w:pPr>
+      <w:r>
+        <w:rPr>
+          <w:b/>
+          <w:bCs/>
+        </w:rPr>
+        <w:t>Bulk Actions</w:t>
+      </w:r>
+      <w:r>
+        <w:t>: Support for multi-file downloads (ZIP generation) and bulk metadata tagging.</w:t>
+      </w:r>
+    </w:p>
+    <w:p>
+      <w:pPr>
+        <w:rPr>
+          <w:b/>
+          <w:bCs/>
+        </w:rPr>
+      </w:pPr>
+      <w:r>
+        <w:rPr>
+          <w:b/>
+          <w:bCs/>
+        </w:rPr>
+        <w:t>2. Granular Access Control (RBAC)</w:t>
+      </w:r>
+    </w:p>
+    <w:p>
+      <w:pPr>
+        <w:numPr>
+          <w:ilvl w:val="0"/>
+          <w:numId w:val="34"/>
+        </w:numPr>
+      </w:pPr>
+      <w:r>
+        <w:rPr>
+          <w:b/>
+          <w:bCs/>
+        </w:rPr>
+        <w:t>Role-Based Permissions</w:t>
+      </w:r>
+      <w:r>
+        <w:t>: Transition from simple authentication to a multi-tiered role system:</w:t>
+      </w:r>
+    </w:p>
+    <w:p>
+      <w:pPr>
+        <w:numPr>
+          <w:ilvl w:val="1"/>
+          <w:numId w:val="34"/>
+        </w:numPr>
+      </w:pPr>
+      <w:r>
+        <w:rPr>
+          <w:i/>
+          <w:iCs/>
+        </w:rPr>
+        <w:t>Super Admin</w:t>
+      </w:r>
+      <w:r>
+        <w:t>: Full system configuration.</w:t>
+      </w:r>
+    </w:p>
+    <w:p>
+      <w:pPr>
+        <w:numPr>
+          <w:ilvl w:val="1"/>
+          <w:numId w:val="34"/>
+        </w:numPr>
+      </w:pPr>
+      <w:r>
+        <w:rPr>
+          <w:i/>
+          <w:iCs/>
+        </w:rPr>
+        <w:t>Project Manager</w:t>
+      </w:r>
+      <w:r>
+        <w:t>: Can create folders and manage all documents in a specific project.</w:t>
+      </w:r>
+    </w:p>
+    <w:p>
+      <w:pPr>
+        <w:numPr>
+          <w:ilvl w:val="1"/>
+          <w:numId w:val="34"/>
+        </w:numPr>
+      </w:pPr>
+      <w:r>
+        <w:rPr>
+          <w:i/>
+          <w:iCs/>
+        </w:rPr>
+        <w:t>Contributor</w:t>
+      </w:r>
+      <w:r>
+        <w:t>: Can upload and edit their own documents.</w:t>
+      </w:r>
+    </w:p>
+    <w:p>
+      <w:pPr>
+        <w:numPr>
+          <w:ilvl w:val="1"/>
+          <w:numId w:val="34"/>
+        </w:numPr>
+      </w:pPr>
+      <w:r>
+        <w:rPr>
+          <w:i/>
+          <w:iCs/>
+        </w:rPr>
+        <w:t>Viewer</w:t>
+      </w:r>
+      <w:r>
+        <w:t>: Read-only access to specific folders.</w:t>
+      </w:r>
+    </w:p>
+    <w:p>
+      <w:pPr>
+        <w:numPr>
+          <w:ilvl w:val="0"/>
+          <w:numId w:val="34"/>
+        </w:numPr>
+      </w:pPr>
+      <w:r>
+        <w:rPr>
+          <w:b/>
+          <w:bCs/>
+        </w:rPr>
+        <w:t>Folder-Level Security</w:t>
+      </w:r>
+      <w:r>
+        <w:t>: Ability to restrict specific sensitive folders to certain users or roles.</w:t>
+      </w:r>
+    </w:p>
+    <w:p>
+      <w:pPr>
+        <w:rPr>
+          <w:b/>
+          <w:bCs/>
+        </w:rPr>
+      </w:pPr>
+      <w:r>
+        <w:rPr>
+          <w:b/>
+          <w:bCs/>
+        </w:rPr>
+        <w:t>3. Governance &amp; Auditability</w:t>
+      </w:r>
+    </w:p>
+    <w:p>
+      <w:pPr>
+        <w:numPr>
+          <w:ilvl w:val="0"/>
+          <w:numId w:val="35"/>
+        </w:numPr>
+      </w:pPr>
+      <w:r>
+        <w:rPr>
+          <w:b/>
+          <w:bCs/>
+        </w:rPr>
+        <w:t>Audit Trails</w:t>
+      </w:r>
+      <w:r>
+        <w:t>: A comprehensive log visible to admins showing "Who, What, and When" for every file upload, download, or deletion.</w:t>
+      </w:r>
+    </w:p>
+    <w:p>
+      <w:pPr>
+        <w:numPr>
+          <w:ilvl w:val="0"/>
+          <w:numId w:val="35"/>
+        </w:numPr>
+      </w:pPr>
+      <w:r>
+        <w:rPr>
+          <w:b/>
+          <w:bCs/>
+        </w:rPr>
+        <w:t>Retention Policies</w:t>
+      </w:r>
+      <w:r>
+        <w:t>: Automated archival or deletion of documents based on project completion dates or regulatory requirements.</w:t>
+      </w:r>
+    </w:p>
+    <w:p>
+      <w:pPr>
+        <w:numPr>
+          <w:ilvl w:val="0"/>
+          <w:numId w:val="35"/>
+        </w:numPr>
+      </w:pPr>
+      <w:r>
+        <w:rPr>
+          <w:b/>
+          <w:bCs/>
+        </w:rPr>
+        <w:t>Activity Dashboard</w:t>
+      </w:r>
+      <w:r>
+        <w:t>: Visual analytics showing document activity trends and storage utilization.</w:t>
+      </w:r>
+    </w:p>
+    <w:p>
+      <w:pPr>
+        <w:rPr>
+          <w:b/>
+          <w:bCs/>
+        </w:rPr>
+      </w:pPr>
+      <w:r>
+        <w:rPr>
+          <w:b/>
+          <w:bCs/>
+        </w:rPr>
+        <w:t>4. Communication &amp; Notifications</w:t>
+      </w:r>
+    </w:p>
+    <w:p>
+      <w:pPr>
+        <w:numPr>
+          <w:ilvl w:val="0"/>
+          <w:numId w:val="36"/>
+        </w:numPr>
+      </w:pPr>
+      <w:r>
+        <w:rPr>
+          <w:b/>
+          <w:bCs/>
+        </w:rPr>
+        <w:t>Automated Alerts</w:t>
+      </w:r>
+      <w:r>
+        <w:t>: Email or in-app notifications when:</w:t>
+      </w:r>
+    </w:p>
+    <w:p>
+      <w:pPr>
+        <w:numPr>
+          <w:ilvl w:val="1"/>
+          <w:numId w:val="36"/>
+        </w:numPr>
+      </w:pPr>
+      <w:r>
+        <w:lastRenderedPageBreak/>
+        <w:t>A new document is uploaded to a project.</w:t>
+      </w:r>
+    </w:p>
+    <w:p>
+      <w:pPr>
+        <w:numPr>
+          <w:ilvl w:val="1"/>
+          <w:numId w:val="36"/>
+        </w:numPr>
+      </w:pPr>
+      <w:r>
+        <w:t>A document is modified or deleted.</w:t>
+      </w:r>
+    </w:p>
+    <w:p>
+      <w:pPr>
+        <w:numPr>
+          <w:ilvl w:val="1"/>
+          <w:numId w:val="36"/>
+        </w:numPr>
+      </w:pPr>
+      <w:r>
+        <w:t>A project milestone is reached.</w:t>
+      </w:r>
+    </w:p>
+    <w:p>
+      <w:pPr>
+        <w:numPr>
+          <w:ilvl w:val="0"/>
+          <w:numId w:val="36"/>
+        </w:numPr>
+      </w:pPr>
+      <w:r>
+        <w:rPr>
+          <w:b/>
+          <w:bCs/>
+        </w:rPr>
+        <w:t>Mention System</w:t>
+      </w:r>
+      <w:r>
+        <w:t>: Ability to @mention users in document comments to trigger direct notifications.</w:t>
+      </w:r>
+    </w:p>
+    <w:p>
+      <w:pPr>
+        <w:rPr>
+          <w:b/>
+          <w:bCs/>
+        </w:rPr>
+      </w:pPr>
+      <w:r>
+        <w:rPr>
+          <w:b/>
+          <w:bCs/>
+        </w:rPr>
+        <w:t>5. Performance &amp; Mobile Readiness</w:t>
+      </w:r>
+    </w:p>
+    <w:p>
+      <w:pPr>
+        <w:numPr>
+          <w:ilvl w:val="0"/>
+          <w:numId w:val="37"/>
+        </w:numPr>
+      </w:pPr>
+      <w:r>
+        <w:rPr>
+          <w:b/>
+          <w:bCs/>
+        </w:rPr>
+        <w:t>Edge Delivery (CDN)</w:t>
+      </w:r>
+      <w:r>
+        <w:t>: Integration of a Content Delivery Network for faster global access to heavy document assets.</w:t>
+      </w:r>
+    </w:p>
+    <w:p>
+      <w:pPr>
+        <w:numPr>
+          <w:ilvl w:val="0"/>
+          <w:numId w:val="37"/>
+        </w:numPr>
+      </w:pPr>
+      <w:r>
+        <w:rPr>
+          <w:b/>
+          <w:bCs/>
+        </w:rPr>
+        <w:t>PWA Support</w:t>
+      </w:r>
+      <w:r>
+        <w:t>: Transform the frontend into a Progressive Web App (PWA) to allow for offline document viewing and a "native-app" feel on mobile devices.</w:t>
+      </w:r>
+    </w:p>
+    <w:p>
+      <w:pPr>
+        <w:numPr>
+          <w:ilvl w:val="0"/>
+          <w:numId w:val="37"/>
+        </w:numPr>
+      </w:pPr>
+      <w:r>
+        <w:rPr>
+          <w:b/>
+          <w:bCs/>
+        </w:rPr>
+        <w:t>Automated Backups</w:t>
+      </w:r>
+      <w:r>
+        <w:t>: Implementation of scheduled, encrypted database and file storage backups to off-site locations (e.g., AWS S3 or Azure Blob).</w:t>
+      </w:r>
+    </w:p>
+    <w:p>
+      <w:pPr>
+        <w:rPr>
+          <w:b/>
+          <w:bCs/>
+        </w:rPr>
+      </w:pPr>
+      <w:r>
+        <w:rPr>
+          <w:b/>
+          <w:bCs/>
+        </w:rPr>
+        <w:t>6. Third-Party Integrations</w:t>
+      </w:r>
+    </w:p>
+    <w:p>
+      <w:pPr>
+        <w:numPr>
+          <w:ilvl w:val="0"/>
+          <w:numId w:val="38"/>
+        </w:numPr>
+      </w:pPr>
+      <w:r>
+        <w:rPr>
+          <w:b/>
+          <w:bCs/>
+        </w:rPr>
+        <w:t>Cloud Sync</w:t>
+      </w:r>
+      <w:r>
+        <w:t>: Optional two-way sync with Google Drive or Microsoft OneDrive for teams using external storage.</w:t>
+      </w:r>
+    </w:p>
+    <w:p>
+      <w:pPr>
+        <w:numPr>
+          <w:ilvl w:val="0"/>
+          <w:numId w:val="38"/>
+        </w:numPr>
+      </w:pPr>
+      <w:r>
+        <w:rPr>
+          <w:b/>
+          <w:bCs/>
+        </w:rPr>
+        <w:t>Document Signing</w:t>
+      </w:r>
+      <w:r>
+        <w:t xml:space="preserve">: Integration with </w:t>
+      </w:r>
+      <w:proofErr w:type="spellStart"/>
+      <w:r>
+        <w:t>DocuSign</w:t>
+      </w:r>
+      <w:proofErr w:type="spellEnd"/>
+      <w:r>
+        <w:t xml:space="preserve"> or similar services for legal approval workflows within the app.</w:t>
       </w:r>
     </w:p>
     <w:p/>
@@ -1749,6 +2441,453 @@
 <file path=word/numbering.xml><?xml version="1.0" encoding="utf-8"?>
 <w:numbering xmlns:wpc="http://schemas.microsoft.com/office/word/2010/wordprocessingCanvas" xmlns:cx="http://schemas.microsoft.com/office/drawing/2014/chartex" xmlns:cx1="http://schemas.microsoft.com/office/drawing/2015/9/8/chartex" xmlns:cx2="http://schemas.microsoft.com/office/drawing/2015/10/21/chartex" xmlns:cx3="http://schemas.microsoft.com/office/drawing/2016/5/9/chartex" xmlns:cx4="http://schemas.microsoft.com/office/drawing/2016/5/10/chartex" xmlns:cx5="http://schemas.microsoft.com/office/drawing/2016/5/11/chartex" xmlns:cx6="http://schemas.microsoft.com/office/drawing/2016/5/12/chartex" xmlns:cx7="http://schemas.microsoft.com/office/drawing/2016/5/13/chartex" xmlns:cx8="http://schemas.microsoft.com/office/drawing/2016/5/14/chartex" xmlns:mc="http://schemas.openxmlformats.org/markup-compatibility/2006" xmlns:aink="http://schemas.microsoft.com/office/drawing/2016/ink" xmlns:am3d="http://schemas.microsoft.com/office/drawing/2017/model3d" xmlns:o="urn:schemas-microsoft-com:office:office" xmlns:oel="http://schemas.microsoft.com/office/2019/extlst" xmlns:r="http://schemas.openxmlformats.org/officeDocument/2006/relationships" xmlns:m="http://schemas.openxmlformats.org/officeDocument/2006/math" xmlns:v="urn:schemas-microsoft-com:vml" xmlns:wp14="http://schemas.microsoft.com/office/word/2010/wordprocessingDrawing" xmlns:wp="http://schemas.openxmlformats.org/drawingml/2006/wordprocessingDrawing" xmlns:w10="urn:schemas-microsoft-com:office:word" xmlns:w="http://schemas.openxmlformats.org/wordprocessingml/2006/main" xmlns:w14="http://schemas.microsoft.com/office/word/2010/wordml" xmlns:w15="http://schemas.microsoft.com/office/word/2012/wordml" xmlns:w16cex="http://schemas.microsoft.com/office/word/2018/wordml/cex" xmlns:w16cid="http://schemas.microsoft.com/office/word/2016/wordml/cid" xmlns:w16="http://schemas.microsoft.com/office/word/2018/wordml" xmlns:w16du="http://schemas.microsoft.com/office/word/2023/wordml/word16du" xmlns:w16sdtdh="http://schemas.microsoft.com/office/word/2020/wordml/sdtdatahash" xmlns:w16sdtfl="http://schemas.microsoft.com/office/word/2024/wordml/sdtformatlock" xmlns:w16se="http://schemas.microsoft.com/office/word/2015/wordml/symex" xmlns:wpg="http://schemas.microsoft.com/office/word/2010/wordprocessingGroup" xmlns:wpi="http://schemas.microsoft.com/office/word/2010/wordprocessingInk" xmlns:wne="http://schemas.microsoft.com/office/word/2006/wordml" xmlns:wps="http://schemas.microsoft.com/office/word/2010/wordprocessingShape" mc:Ignorable="w14 w15 w16se w16cid w16 w16cex w16sdtdh w16sdtfl w16du wp14">
   <w:abstractNum w:abstractNumId="0" w15:restartNumberingAfterBreak="0">
+    <w:nsid w:val="03A90B9C"/>
+    <w:multiLevelType w:val="multilevel"/>
+    <w:tmpl w:val="FDBA7608"/>
+    <w:lvl w:ilvl="0">
+      <w:start w:val="1"/>
+      <w:numFmt w:val="bullet"/>
+      <w:lvlText w:val=""/>
+      <w:lvlJc w:val="left"/>
+      <w:pPr>
+        <w:tabs>
+          <w:tab w:val="num" w:pos="720"/>
+        </w:tabs>
+        <w:ind w:left="720" w:hanging="360"/>
+      </w:pPr>
+      <w:rPr>
+        <w:rFonts w:ascii="Symbol" w:hAnsi="Symbol" w:hint="default"/>
+        <w:sz w:val="20"/>
+      </w:rPr>
+    </w:lvl>
+    <w:lvl w:ilvl="1" w:tentative="1">
+      <w:start w:val="1"/>
+      <w:numFmt w:val="bullet"/>
+      <w:lvlText w:val=""/>
+      <w:lvlJc w:val="left"/>
+      <w:pPr>
+        <w:tabs>
+          <w:tab w:val="num" w:pos="1440"/>
+        </w:tabs>
+        <w:ind w:left="1440" w:hanging="360"/>
+      </w:pPr>
+      <w:rPr>
+        <w:rFonts w:ascii="Symbol" w:hAnsi="Symbol" w:hint="default"/>
+        <w:sz w:val="20"/>
+      </w:rPr>
+    </w:lvl>
+    <w:lvl w:ilvl="2" w:tentative="1">
+      <w:start w:val="1"/>
+      <w:numFmt w:val="bullet"/>
+      <w:lvlText w:val=""/>
+      <w:lvlJc w:val="left"/>
+      <w:pPr>
+        <w:tabs>
+          <w:tab w:val="num" w:pos="2160"/>
+        </w:tabs>
+        <w:ind w:left="2160" w:hanging="360"/>
+      </w:pPr>
+      <w:rPr>
+        <w:rFonts w:ascii="Symbol" w:hAnsi="Symbol" w:hint="default"/>
+        <w:sz w:val="20"/>
+      </w:rPr>
+    </w:lvl>
+    <w:lvl w:ilvl="3" w:tentative="1">
+      <w:start w:val="1"/>
+      <w:numFmt w:val="bullet"/>
+      <w:lvlText w:val=""/>
+      <w:lvlJc w:val="left"/>
+      <w:pPr>
+        <w:tabs>
+          <w:tab w:val="num" w:pos="2880"/>
+        </w:tabs>
+        <w:ind w:left="2880" w:hanging="360"/>
+      </w:pPr>
+      <w:rPr>
+        <w:rFonts w:ascii="Symbol" w:hAnsi="Symbol" w:hint="default"/>
+        <w:sz w:val="20"/>
+      </w:rPr>
+    </w:lvl>
+    <w:lvl w:ilvl="4" w:tentative="1">
+      <w:start w:val="1"/>
+      <w:numFmt w:val="bullet"/>
+      <w:lvlText w:val=""/>
+      <w:lvlJc w:val="left"/>
+      <w:pPr>
+        <w:tabs>
+          <w:tab w:val="num" w:pos="3600"/>
+        </w:tabs>
+        <w:ind w:left="3600" w:hanging="360"/>
+      </w:pPr>
+      <w:rPr>
+        <w:rFonts w:ascii="Symbol" w:hAnsi="Symbol" w:hint="default"/>
+        <w:sz w:val="20"/>
+      </w:rPr>
+    </w:lvl>
+    <w:lvl w:ilvl="5" w:tentative="1">
+      <w:start w:val="1"/>
+      <w:numFmt w:val="bullet"/>
+      <w:lvlText w:val=""/>
+      <w:lvlJc w:val="left"/>
+      <w:pPr>
+        <w:tabs>
+          <w:tab w:val="num" w:pos="4320"/>
+        </w:tabs>
+        <w:ind w:left="4320" w:hanging="360"/>
+      </w:pPr>
+      <w:rPr>
+        <w:rFonts w:ascii="Symbol" w:hAnsi="Symbol" w:hint="default"/>
+        <w:sz w:val="20"/>
+      </w:rPr>
+    </w:lvl>
+    <w:lvl w:ilvl="6" w:tentative="1">
+      <w:start w:val="1"/>
+      <w:numFmt w:val="bullet"/>
+      <w:lvlText w:val=""/>
+      <w:lvlJc w:val="left"/>
+      <w:pPr>
+        <w:tabs>
+          <w:tab w:val="num" w:pos="5040"/>
+        </w:tabs>
+        <w:ind w:left="5040" w:hanging="360"/>
+      </w:pPr>
+      <w:rPr>
+        <w:rFonts w:ascii="Symbol" w:hAnsi="Symbol" w:hint="default"/>
+        <w:sz w:val="20"/>
+      </w:rPr>
+    </w:lvl>
+    <w:lvl w:ilvl="7" w:tentative="1">
+      <w:start w:val="1"/>
+      <w:numFmt w:val="bullet"/>
+      <w:lvlText w:val=""/>
+      <w:lvlJc w:val="left"/>
+      <w:pPr>
+        <w:tabs>
+          <w:tab w:val="num" w:pos="5760"/>
+        </w:tabs>
+        <w:ind w:left="5760" w:hanging="360"/>
+      </w:pPr>
+      <w:rPr>
+        <w:rFonts w:ascii="Symbol" w:hAnsi="Symbol" w:hint="default"/>
+        <w:sz w:val="20"/>
+      </w:rPr>
+    </w:lvl>
+    <w:lvl w:ilvl="8" w:tentative="1">
+      <w:start w:val="1"/>
+      <w:numFmt w:val="bullet"/>
+      <w:lvlText w:val=""/>
+      <w:lvlJc w:val="left"/>
+      <w:pPr>
+        <w:tabs>
+          <w:tab w:val="num" w:pos="6480"/>
+        </w:tabs>
+        <w:ind w:left="6480" w:hanging="360"/>
+      </w:pPr>
+      <w:rPr>
+        <w:rFonts w:ascii="Symbol" w:hAnsi="Symbol" w:hint="default"/>
+        <w:sz w:val="20"/>
+      </w:rPr>
+    </w:lvl>
+  </w:abstractNum>
+  <w:abstractNum w:abstractNumId="1" w15:restartNumberingAfterBreak="0">
+    <w:nsid w:val="04CE09D2"/>
+    <w:multiLevelType w:val="multilevel"/>
+    <w:tmpl w:val="BE846A64"/>
+    <w:lvl w:ilvl="0">
+      <w:start w:val="1"/>
+      <w:numFmt w:val="bullet"/>
+      <w:lvlText w:val=""/>
+      <w:lvlJc w:val="left"/>
+      <w:pPr>
+        <w:tabs>
+          <w:tab w:val="num" w:pos="720"/>
+        </w:tabs>
+        <w:ind w:left="720" w:hanging="360"/>
+      </w:pPr>
+      <w:rPr>
+        <w:rFonts w:ascii="Symbol" w:hAnsi="Symbol" w:hint="default"/>
+        <w:sz w:val="20"/>
+      </w:rPr>
+    </w:lvl>
+    <w:lvl w:ilvl="1" w:tentative="1">
+      <w:start w:val="1"/>
+      <w:numFmt w:val="bullet"/>
+      <w:lvlText w:val=""/>
+      <w:lvlJc w:val="left"/>
+      <w:pPr>
+        <w:tabs>
+          <w:tab w:val="num" w:pos="1440"/>
+        </w:tabs>
+        <w:ind w:left="1440" w:hanging="360"/>
+      </w:pPr>
+      <w:rPr>
+        <w:rFonts w:ascii="Symbol" w:hAnsi="Symbol" w:hint="default"/>
+        <w:sz w:val="20"/>
+      </w:rPr>
+    </w:lvl>
+    <w:lvl w:ilvl="2" w:tentative="1">
+      <w:start w:val="1"/>
+      <w:numFmt w:val="bullet"/>
+      <w:lvlText w:val=""/>
+      <w:lvlJc w:val="left"/>
+      <w:pPr>
+        <w:tabs>
+          <w:tab w:val="num" w:pos="2160"/>
+        </w:tabs>
+        <w:ind w:left="2160" w:hanging="360"/>
+      </w:pPr>
+      <w:rPr>
+        <w:rFonts w:ascii="Symbol" w:hAnsi="Symbol" w:hint="default"/>
+        <w:sz w:val="20"/>
+      </w:rPr>
+    </w:lvl>
+    <w:lvl w:ilvl="3" w:tentative="1">
+      <w:start w:val="1"/>
+      <w:numFmt w:val="bullet"/>
+      <w:lvlText w:val=""/>
+      <w:lvlJc w:val="left"/>
+      <w:pPr>
+        <w:tabs>
+          <w:tab w:val="num" w:pos="2880"/>
+        </w:tabs>
+        <w:ind w:left="2880" w:hanging="360"/>
+      </w:pPr>
+      <w:rPr>
+        <w:rFonts w:ascii="Symbol" w:hAnsi="Symbol" w:hint="default"/>
+        <w:sz w:val="20"/>
+      </w:rPr>
+    </w:lvl>
+    <w:lvl w:ilvl="4" w:tentative="1">
+      <w:start w:val="1"/>
+      <w:numFmt w:val="bullet"/>
+      <w:lvlText w:val=""/>
+      <w:lvlJc w:val="left"/>
+      <w:pPr>
+        <w:tabs>
+          <w:tab w:val="num" w:pos="3600"/>
+        </w:tabs>
+        <w:ind w:left="3600" w:hanging="360"/>
+      </w:pPr>
+      <w:rPr>
+        <w:rFonts w:ascii="Symbol" w:hAnsi="Symbol" w:hint="default"/>
+        <w:sz w:val="20"/>
+      </w:rPr>
+    </w:lvl>
+    <w:lvl w:ilvl="5" w:tentative="1">
+      <w:start w:val="1"/>
+      <w:numFmt w:val="bullet"/>
+      <w:lvlText w:val=""/>
+      <w:lvlJc w:val="left"/>
+      <w:pPr>
+        <w:tabs>
+          <w:tab w:val="num" w:pos="4320"/>
+        </w:tabs>
+        <w:ind w:left="4320" w:hanging="360"/>
+      </w:pPr>
+      <w:rPr>
+        <w:rFonts w:ascii="Symbol" w:hAnsi="Symbol" w:hint="default"/>
+        <w:sz w:val="20"/>
+      </w:rPr>
+    </w:lvl>
+    <w:lvl w:ilvl="6" w:tentative="1">
+      <w:start w:val="1"/>
+      <w:numFmt w:val="bullet"/>
+      <w:lvlText w:val=""/>
+      <w:lvlJc w:val="left"/>
+      <w:pPr>
+        <w:tabs>
+          <w:tab w:val="num" w:pos="5040"/>
+        </w:tabs>
+        <w:ind w:left="5040" w:hanging="360"/>
+      </w:pPr>
+      <w:rPr>
+        <w:rFonts w:ascii="Symbol" w:hAnsi="Symbol" w:hint="default"/>
+        <w:sz w:val="20"/>
+      </w:rPr>
+    </w:lvl>
+    <w:lvl w:ilvl="7" w:tentative="1">
+      <w:start w:val="1"/>
+      <w:numFmt w:val="bullet"/>
+      <w:lvlText w:val=""/>
+      <w:lvlJc w:val="left"/>
+      <w:pPr>
+        <w:tabs>
+          <w:tab w:val="num" w:pos="5760"/>
+        </w:tabs>
+        <w:ind w:left="5760" w:hanging="360"/>
+      </w:pPr>
+      <w:rPr>
+        <w:rFonts w:ascii="Symbol" w:hAnsi="Symbol" w:hint="default"/>
+        <w:sz w:val="20"/>
+      </w:rPr>
+    </w:lvl>
+    <w:lvl w:ilvl="8" w:tentative="1">
+      <w:start w:val="1"/>
+      <w:numFmt w:val="bullet"/>
+      <w:lvlText w:val=""/>
+      <w:lvlJc w:val="left"/>
+      <w:pPr>
+        <w:tabs>
+          <w:tab w:val="num" w:pos="6480"/>
+        </w:tabs>
+        <w:ind w:left="6480" w:hanging="360"/>
+      </w:pPr>
+      <w:rPr>
+        <w:rFonts w:ascii="Symbol" w:hAnsi="Symbol" w:hint="default"/>
+        <w:sz w:val="20"/>
+      </w:rPr>
+    </w:lvl>
+  </w:abstractNum>
+  <w:abstractNum w:abstractNumId="2" w15:restartNumberingAfterBreak="0">
+    <w:nsid w:val="0639674C"/>
+    <w:multiLevelType w:val="multilevel"/>
+    <w:tmpl w:val="4816D4DC"/>
+    <w:lvl w:ilvl="0">
+      <w:start w:val="1"/>
+      <w:numFmt w:val="bullet"/>
+      <w:lvlText w:val=""/>
+      <w:lvlJc w:val="left"/>
+      <w:pPr>
+        <w:tabs>
+          <w:tab w:val="num" w:pos="720"/>
+        </w:tabs>
+        <w:ind w:left="720" w:hanging="360"/>
+      </w:pPr>
+      <w:rPr>
+        <w:rFonts w:ascii="Symbol" w:hAnsi="Symbol" w:hint="default"/>
+        <w:sz w:val="20"/>
+      </w:rPr>
+    </w:lvl>
+    <w:lvl w:ilvl="1" w:tentative="1">
+      <w:start w:val="1"/>
+      <w:numFmt w:val="bullet"/>
+      <w:lvlText w:val=""/>
+      <w:lvlJc w:val="left"/>
+      <w:pPr>
+        <w:tabs>
+          <w:tab w:val="num" w:pos="1440"/>
+        </w:tabs>
+        <w:ind w:left="1440" w:hanging="360"/>
+      </w:pPr>
+      <w:rPr>
+        <w:rFonts w:ascii="Symbol" w:hAnsi="Symbol" w:hint="default"/>
+        <w:sz w:val="20"/>
+      </w:rPr>
+    </w:lvl>
+    <w:lvl w:ilvl="2" w:tentative="1">
+      <w:start w:val="1"/>
+      <w:numFmt w:val="bullet"/>
+      <w:lvlText w:val=""/>
+      <w:lvlJc w:val="left"/>
+      <w:pPr>
+        <w:tabs>
+          <w:tab w:val="num" w:pos="2160"/>
+        </w:tabs>
+        <w:ind w:left="2160" w:hanging="360"/>
+      </w:pPr>
+      <w:rPr>
+        <w:rFonts w:ascii="Symbol" w:hAnsi="Symbol" w:hint="default"/>
+        <w:sz w:val="20"/>
+      </w:rPr>
+    </w:lvl>
+    <w:lvl w:ilvl="3" w:tentative="1">
+      <w:start w:val="1"/>
+      <w:numFmt w:val="bullet"/>
+      <w:lvlText w:val=""/>
+      <w:lvlJc w:val="left"/>
+      <w:pPr>
+        <w:tabs>
+          <w:tab w:val="num" w:pos="2880"/>
+        </w:tabs>
+        <w:ind w:left="2880" w:hanging="360"/>
+      </w:pPr>
+      <w:rPr>
+        <w:rFonts w:ascii="Symbol" w:hAnsi="Symbol" w:hint="default"/>
+        <w:sz w:val="20"/>
+      </w:rPr>
+    </w:lvl>
+    <w:lvl w:ilvl="4" w:tentative="1">
+      <w:start w:val="1"/>
+      <w:numFmt w:val="bullet"/>
+      <w:lvlText w:val=""/>
+      <w:lvlJc w:val="left"/>
+      <w:pPr>
+        <w:tabs>
+          <w:tab w:val="num" w:pos="3600"/>
+        </w:tabs>
+        <w:ind w:left="3600" w:hanging="360"/>
+      </w:pPr>
+      <w:rPr>
+        <w:rFonts w:ascii="Symbol" w:hAnsi="Symbol" w:hint="default"/>
+        <w:sz w:val="20"/>
+      </w:rPr>
+    </w:lvl>
+    <w:lvl w:ilvl="5" w:tentative="1">
+      <w:start w:val="1"/>
+      <w:numFmt w:val="bullet"/>
+      <w:lvlText w:val=""/>
+      <w:lvlJc w:val="left"/>
+      <w:pPr>
+        <w:tabs>
+          <w:tab w:val="num" w:pos="4320"/>
+        </w:tabs>
+        <w:ind w:left="4320" w:hanging="360"/>
+      </w:pPr>
+      <w:rPr>
+        <w:rFonts w:ascii="Symbol" w:hAnsi="Symbol" w:hint="default"/>
+        <w:sz w:val="20"/>
+      </w:rPr>
+    </w:lvl>
+    <w:lvl w:ilvl="6" w:tentative="1">
+      <w:start w:val="1"/>
+      <w:numFmt w:val="bullet"/>
+      <w:lvlText w:val=""/>
+      <w:lvlJc w:val="left"/>
+      <w:pPr>
+        <w:tabs>
+          <w:tab w:val="num" w:pos="5040"/>
+        </w:tabs>
+        <w:ind w:left="5040" w:hanging="360"/>
+      </w:pPr>
+      <w:rPr>
+        <w:rFonts w:ascii="Symbol" w:hAnsi="Symbol" w:hint="default"/>
+        <w:sz w:val="20"/>
+      </w:rPr>
+    </w:lvl>
+    <w:lvl w:ilvl="7" w:tentative="1">
+      <w:start w:val="1"/>
+      <w:numFmt w:val="bullet"/>
+      <w:lvlText w:val=""/>
+      <w:lvlJc w:val="left"/>
+      <w:pPr>
+        <w:tabs>
+          <w:tab w:val="num" w:pos="5760"/>
+        </w:tabs>
+        <w:ind w:left="5760" w:hanging="360"/>
+      </w:pPr>
+      <w:rPr>
+        <w:rFonts w:ascii="Symbol" w:hAnsi="Symbol" w:hint="default"/>
+        <w:sz w:val="20"/>
+      </w:rPr>
+    </w:lvl>
+    <w:lvl w:ilvl="8" w:tentative="1">
+      <w:start w:val="1"/>
+      <w:numFmt w:val="bullet"/>
+      <w:lvlText w:val=""/>
+      <w:lvlJc w:val="left"/>
+      <w:pPr>
+        <w:tabs>
+          <w:tab w:val="num" w:pos="6480"/>
+        </w:tabs>
+        <w:ind w:left="6480" w:hanging="360"/>
+      </w:pPr>
+      <w:rPr>
+        <w:rFonts w:ascii="Symbol" w:hAnsi="Symbol" w:hint="default"/>
+        <w:sz w:val="20"/>
+      </w:rPr>
+    </w:lvl>
+  </w:abstractNum>
+  <w:abstractNum w:abstractNumId="3" w15:restartNumberingAfterBreak="0">
     <w:nsid w:val="07305BEA"/>
     <w:multiLevelType w:val="multilevel"/>
     <w:tmpl w:val="BC5CD03C"/>
@@ -1897,7 +3036,7 @@
       </w:rPr>
     </w:lvl>
   </w:abstractNum>
-  <w:abstractNum w:abstractNumId="1" w15:restartNumberingAfterBreak="0">
+  <w:abstractNum w:abstractNumId="4" w15:restartNumberingAfterBreak="0">
     <w:nsid w:val="0B700276"/>
     <w:multiLevelType w:val="multilevel"/>
     <w:tmpl w:val="3BEAE6B0"/>
@@ -2010,7 +3149,7 @@
       </w:pPr>
     </w:lvl>
   </w:abstractNum>
-  <w:abstractNum w:abstractNumId="2" w15:restartNumberingAfterBreak="0">
+  <w:abstractNum w:abstractNumId="5" w15:restartNumberingAfterBreak="0">
     <w:nsid w:val="0D1F0B9A"/>
     <w:multiLevelType w:val="multilevel"/>
     <w:tmpl w:val="73A63B0A"/>
@@ -2159,7 +3298,7 @@
       </w:rPr>
     </w:lvl>
   </w:abstractNum>
-  <w:abstractNum w:abstractNumId="3" w15:restartNumberingAfterBreak="0">
+  <w:abstractNum w:abstractNumId="6" w15:restartNumberingAfterBreak="0">
     <w:nsid w:val="17931C76"/>
     <w:multiLevelType w:val="multilevel"/>
     <w:tmpl w:val="3DC87032"/>
@@ -2272,7 +3411,7 @@
       </w:pPr>
     </w:lvl>
   </w:abstractNum>
-  <w:abstractNum w:abstractNumId="4" w15:restartNumberingAfterBreak="0">
+  <w:abstractNum w:abstractNumId="7" w15:restartNumberingAfterBreak="0">
     <w:nsid w:val="1E623EE4"/>
     <w:multiLevelType w:val="multilevel"/>
     <w:tmpl w:val="D7101B7A"/>
@@ -2421,7 +3560,7 @@
       </w:rPr>
     </w:lvl>
   </w:abstractNum>
-  <w:abstractNum w:abstractNumId="5" w15:restartNumberingAfterBreak="0">
+  <w:abstractNum w:abstractNumId="8" w15:restartNumberingAfterBreak="0">
     <w:nsid w:val="21DA735F"/>
     <w:multiLevelType w:val="multilevel"/>
     <w:tmpl w:val="9CDC2C42"/>
@@ -2570,7 +3709,156 @@
       </w:rPr>
     </w:lvl>
   </w:abstractNum>
-  <w:abstractNum w:abstractNumId="6" w15:restartNumberingAfterBreak="0">
+  <w:abstractNum w:abstractNumId="9" w15:restartNumberingAfterBreak="0">
+    <w:nsid w:val="22BA7B3D"/>
+    <w:multiLevelType w:val="multilevel"/>
+    <w:tmpl w:val="420C4082"/>
+    <w:lvl w:ilvl="0">
+      <w:start w:val="1"/>
+      <w:numFmt w:val="bullet"/>
+      <w:lvlText w:val=""/>
+      <w:lvlJc w:val="left"/>
+      <w:pPr>
+        <w:tabs>
+          <w:tab w:val="num" w:pos="720"/>
+        </w:tabs>
+        <w:ind w:left="720" w:hanging="360"/>
+      </w:pPr>
+      <w:rPr>
+        <w:rFonts w:ascii="Symbol" w:hAnsi="Symbol" w:hint="default"/>
+        <w:sz w:val="20"/>
+      </w:rPr>
+    </w:lvl>
+    <w:lvl w:ilvl="1">
+      <w:start w:val="1"/>
+      <w:numFmt w:val="bullet"/>
+      <w:lvlText w:val=""/>
+      <w:lvlJc w:val="left"/>
+      <w:pPr>
+        <w:tabs>
+          <w:tab w:val="num" w:pos="1440"/>
+        </w:tabs>
+        <w:ind w:left="1440" w:hanging="360"/>
+      </w:pPr>
+      <w:rPr>
+        <w:rFonts w:ascii="Symbol" w:hAnsi="Symbol" w:hint="default"/>
+        <w:sz w:val="20"/>
+      </w:rPr>
+    </w:lvl>
+    <w:lvl w:ilvl="2" w:tentative="1">
+      <w:start w:val="1"/>
+      <w:numFmt w:val="bullet"/>
+      <w:lvlText w:val=""/>
+      <w:lvlJc w:val="left"/>
+      <w:pPr>
+        <w:tabs>
+          <w:tab w:val="num" w:pos="2160"/>
+        </w:tabs>
+        <w:ind w:left="2160" w:hanging="360"/>
+      </w:pPr>
+      <w:rPr>
+        <w:rFonts w:ascii="Symbol" w:hAnsi="Symbol" w:hint="default"/>
+        <w:sz w:val="20"/>
+      </w:rPr>
+    </w:lvl>
+    <w:lvl w:ilvl="3" w:tentative="1">
+      <w:start w:val="1"/>
+      <w:numFmt w:val="bullet"/>
+      <w:lvlText w:val=""/>
+      <w:lvlJc w:val="left"/>
+      <w:pPr>
+        <w:tabs>
+          <w:tab w:val="num" w:pos="2880"/>
+        </w:tabs>
+        <w:ind w:left="2880" w:hanging="360"/>
+      </w:pPr>
+      <w:rPr>
+        <w:rFonts w:ascii="Symbol" w:hAnsi="Symbol" w:hint="default"/>
+        <w:sz w:val="20"/>
+      </w:rPr>
+    </w:lvl>
+    <w:lvl w:ilvl="4" w:tentative="1">
+      <w:start w:val="1"/>
+      <w:numFmt w:val="bullet"/>
+      <w:lvlText w:val=""/>
+      <w:lvlJc w:val="left"/>
+      <w:pPr>
+        <w:tabs>
+          <w:tab w:val="num" w:pos="3600"/>
+        </w:tabs>
+        <w:ind w:left="3600" w:hanging="360"/>
+      </w:pPr>
+      <w:rPr>
+        <w:rFonts w:ascii="Symbol" w:hAnsi="Symbol" w:hint="default"/>
+        <w:sz w:val="20"/>
+      </w:rPr>
+    </w:lvl>
+    <w:lvl w:ilvl="5" w:tentative="1">
+      <w:start w:val="1"/>
+      <w:numFmt w:val="bullet"/>
+      <w:lvlText w:val=""/>
+      <w:lvlJc w:val="left"/>
+      <w:pPr>
+        <w:tabs>
+          <w:tab w:val="num" w:pos="4320"/>
+        </w:tabs>
+        <w:ind w:left="4320" w:hanging="360"/>
+      </w:pPr>
+      <w:rPr>
+        <w:rFonts w:ascii="Symbol" w:hAnsi="Symbol" w:hint="default"/>
+        <w:sz w:val="20"/>
+      </w:rPr>
+    </w:lvl>
+    <w:lvl w:ilvl="6" w:tentative="1">
+      <w:start w:val="1"/>
+      <w:numFmt w:val="bullet"/>
+      <w:lvlText w:val=""/>
+      <w:lvlJc w:val="left"/>
+      <w:pPr>
+        <w:tabs>
+          <w:tab w:val="num" w:pos="5040"/>
+        </w:tabs>
+        <w:ind w:left="5040" w:hanging="360"/>
+      </w:pPr>
+      <w:rPr>
+        <w:rFonts w:ascii="Symbol" w:hAnsi="Symbol" w:hint="default"/>
+        <w:sz w:val="20"/>
+      </w:rPr>
+    </w:lvl>
+    <w:lvl w:ilvl="7" w:tentative="1">
+      <w:start w:val="1"/>
+      <w:numFmt w:val="bullet"/>
+      <w:lvlText w:val=""/>
+      <w:lvlJc w:val="left"/>
+      <w:pPr>
+        <w:tabs>
+          <w:tab w:val="num" w:pos="5760"/>
+        </w:tabs>
+        <w:ind w:left="5760" w:hanging="360"/>
+      </w:pPr>
+      <w:rPr>
+        <w:rFonts w:ascii="Symbol" w:hAnsi="Symbol" w:hint="default"/>
+        <w:sz w:val="20"/>
+      </w:rPr>
+    </w:lvl>
+    <w:lvl w:ilvl="8" w:tentative="1">
+      <w:start w:val="1"/>
+      <w:numFmt w:val="bullet"/>
+      <w:lvlText w:val=""/>
+      <w:lvlJc w:val="left"/>
+      <w:pPr>
+        <w:tabs>
+          <w:tab w:val="num" w:pos="6480"/>
+        </w:tabs>
+        <w:ind w:left="6480" w:hanging="360"/>
+      </w:pPr>
+      <w:rPr>
+        <w:rFonts w:ascii="Symbol" w:hAnsi="Symbol" w:hint="default"/>
+        <w:sz w:val="20"/>
+      </w:rPr>
+    </w:lvl>
+  </w:abstractNum>
+  <w:abstractNum w:abstractNumId="10" w15:restartNumberingAfterBreak="0">
     <w:nsid w:val="29F0099A"/>
     <w:multiLevelType w:val="multilevel"/>
     <w:tmpl w:val="33466210"/>
@@ -2719,7 +4007,7 @@
       </w:rPr>
     </w:lvl>
   </w:abstractNum>
-  <w:abstractNum w:abstractNumId="7" w15:restartNumberingAfterBreak="0">
+  <w:abstractNum w:abstractNumId="11" w15:restartNumberingAfterBreak="0">
     <w:nsid w:val="2C5445F8"/>
     <w:multiLevelType w:val="multilevel"/>
     <w:tmpl w:val="1AAA6BAA"/>
@@ -2868,7 +4156,7 @@
       </w:rPr>
     </w:lvl>
   </w:abstractNum>
-  <w:abstractNum w:abstractNumId="8" w15:restartNumberingAfterBreak="0">
+  <w:abstractNum w:abstractNumId="12" w15:restartNumberingAfterBreak="0">
     <w:nsid w:val="2C880905"/>
     <w:multiLevelType w:val="multilevel"/>
     <w:tmpl w:val="6E5AF320"/>
@@ -3017,7 +4305,156 @@
       </w:rPr>
     </w:lvl>
   </w:abstractNum>
-  <w:abstractNum w:abstractNumId="9" w15:restartNumberingAfterBreak="0">
+  <w:abstractNum w:abstractNumId="13" w15:restartNumberingAfterBreak="0">
+    <w:nsid w:val="2E5938B9"/>
+    <w:multiLevelType w:val="multilevel"/>
+    <w:tmpl w:val="B6707772"/>
+    <w:lvl w:ilvl="0">
+      <w:start w:val="1"/>
+      <w:numFmt w:val="bullet"/>
+      <w:lvlText w:val=""/>
+      <w:lvlJc w:val="left"/>
+      <w:pPr>
+        <w:tabs>
+          <w:tab w:val="num" w:pos="720"/>
+        </w:tabs>
+        <w:ind w:left="720" w:hanging="360"/>
+      </w:pPr>
+      <w:rPr>
+        <w:rFonts w:ascii="Symbol" w:hAnsi="Symbol" w:hint="default"/>
+        <w:sz w:val="20"/>
+      </w:rPr>
+    </w:lvl>
+    <w:lvl w:ilvl="1">
+      <w:start w:val="1"/>
+      <w:numFmt w:val="bullet"/>
+      <w:lvlText w:val=""/>
+      <w:lvlJc w:val="left"/>
+      <w:pPr>
+        <w:tabs>
+          <w:tab w:val="num" w:pos="1440"/>
+        </w:tabs>
+        <w:ind w:left="1440" w:hanging="360"/>
+      </w:pPr>
+      <w:rPr>
+        <w:rFonts w:ascii="Symbol" w:hAnsi="Symbol" w:hint="default"/>
+        <w:sz w:val="20"/>
+      </w:rPr>
+    </w:lvl>
+    <w:lvl w:ilvl="2" w:tentative="1">
+      <w:start w:val="1"/>
+      <w:numFmt w:val="bullet"/>
+      <w:lvlText w:val=""/>
+      <w:lvlJc w:val="left"/>
+      <w:pPr>
+        <w:tabs>
+          <w:tab w:val="num" w:pos="2160"/>
+        </w:tabs>
+        <w:ind w:left="2160" w:hanging="360"/>
+      </w:pPr>
+      <w:rPr>
+        <w:rFonts w:ascii="Symbol" w:hAnsi="Symbol" w:hint="default"/>
+        <w:sz w:val="20"/>
+      </w:rPr>
+    </w:lvl>
+    <w:lvl w:ilvl="3" w:tentative="1">
+      <w:start w:val="1"/>
+      <w:numFmt w:val="bullet"/>
+      <w:lvlText w:val=""/>
+      <w:lvlJc w:val="left"/>
+      <w:pPr>
+        <w:tabs>
+          <w:tab w:val="num" w:pos="2880"/>
+        </w:tabs>
+        <w:ind w:left="2880" w:hanging="360"/>
+      </w:pPr>
+      <w:rPr>
+        <w:rFonts w:ascii="Symbol" w:hAnsi="Symbol" w:hint="default"/>
+        <w:sz w:val="20"/>
+      </w:rPr>
+    </w:lvl>
+    <w:lvl w:ilvl="4" w:tentative="1">
+      <w:start w:val="1"/>
+      <w:numFmt w:val="bullet"/>
+      <w:lvlText w:val=""/>
+      <w:lvlJc w:val="left"/>
+      <w:pPr>
+        <w:tabs>
+          <w:tab w:val="num" w:pos="3600"/>
+        </w:tabs>
+        <w:ind w:left="3600" w:hanging="360"/>
+      </w:pPr>
+      <w:rPr>
+        <w:rFonts w:ascii="Symbol" w:hAnsi="Symbol" w:hint="default"/>
+        <w:sz w:val="20"/>
+      </w:rPr>
+    </w:lvl>
+    <w:lvl w:ilvl="5" w:tentative="1">
+      <w:start w:val="1"/>
+      <w:numFmt w:val="bullet"/>
+      <w:lvlText w:val=""/>
+      <w:lvlJc w:val="left"/>
+      <w:pPr>
+        <w:tabs>
+          <w:tab w:val="num" w:pos="4320"/>
+        </w:tabs>
+        <w:ind w:left="4320" w:hanging="360"/>
+      </w:pPr>
+      <w:rPr>
+        <w:rFonts w:ascii="Symbol" w:hAnsi="Symbol" w:hint="default"/>
+        <w:sz w:val="20"/>
+      </w:rPr>
+    </w:lvl>
+    <w:lvl w:ilvl="6" w:tentative="1">
+      <w:start w:val="1"/>
+      <w:numFmt w:val="bullet"/>
+      <w:lvlText w:val=""/>
+      <w:lvlJc w:val="left"/>
+      <w:pPr>
+        <w:tabs>
+          <w:tab w:val="num" w:pos="5040"/>
+        </w:tabs>
+        <w:ind w:left="5040" w:hanging="360"/>
+      </w:pPr>
+      <w:rPr>
+        <w:rFonts w:ascii="Symbol" w:hAnsi="Symbol" w:hint="default"/>
+        <w:sz w:val="20"/>
+      </w:rPr>
+    </w:lvl>
+    <w:lvl w:ilvl="7" w:tentative="1">
+      <w:start w:val="1"/>
+      <w:numFmt w:val="bullet"/>
+      <w:lvlText w:val=""/>
+      <w:lvlJc w:val="left"/>
+      <w:pPr>
+        <w:tabs>
+          <w:tab w:val="num" w:pos="5760"/>
+        </w:tabs>
+        <w:ind w:left="5760" w:hanging="360"/>
+      </w:pPr>
+      <w:rPr>
+        <w:rFonts w:ascii="Symbol" w:hAnsi="Symbol" w:hint="default"/>
+        <w:sz w:val="20"/>
+      </w:rPr>
+    </w:lvl>
+    <w:lvl w:ilvl="8" w:tentative="1">
+      <w:start w:val="1"/>
+      <w:numFmt w:val="bullet"/>
+      <w:lvlText w:val=""/>
+      <w:lvlJc w:val="left"/>
+      <w:pPr>
+        <w:tabs>
+          <w:tab w:val="num" w:pos="6480"/>
+        </w:tabs>
+        <w:ind w:left="6480" w:hanging="360"/>
+      </w:pPr>
+      <w:rPr>
+        <w:rFonts w:ascii="Symbol" w:hAnsi="Symbol" w:hint="default"/>
+        <w:sz w:val="20"/>
+      </w:rPr>
+    </w:lvl>
+  </w:abstractNum>
+  <w:abstractNum w:abstractNumId="14" w15:restartNumberingAfterBreak="0">
     <w:nsid w:val="306C5198"/>
     <w:multiLevelType w:val="multilevel"/>
     <w:tmpl w:val="DC50ABDE"/>
@@ -3166,7 +4603,7 @@
       </w:rPr>
     </w:lvl>
   </w:abstractNum>
-  <w:abstractNum w:abstractNumId="10" w15:restartNumberingAfterBreak="0">
+  <w:abstractNum w:abstractNumId="15" w15:restartNumberingAfterBreak="0">
     <w:nsid w:val="31205D4F"/>
     <w:multiLevelType w:val="multilevel"/>
     <w:tmpl w:val="D7125AB2"/>
@@ -3315,7 +4752,7 @@
       </w:rPr>
     </w:lvl>
   </w:abstractNum>
-  <w:abstractNum w:abstractNumId="11" w15:restartNumberingAfterBreak="0">
+  <w:abstractNum w:abstractNumId="16" w15:restartNumberingAfterBreak="0">
     <w:nsid w:val="332A0BE5"/>
     <w:multiLevelType w:val="multilevel"/>
     <w:tmpl w:val="0B921FC2"/>
@@ -3464,7 +4901,7 @@
       </w:rPr>
     </w:lvl>
   </w:abstractNum>
-  <w:abstractNum w:abstractNumId="12" w15:restartNumberingAfterBreak="0">
+  <w:abstractNum w:abstractNumId="17" w15:restartNumberingAfterBreak="0">
     <w:nsid w:val="35C34305"/>
     <w:multiLevelType w:val="multilevel"/>
     <w:tmpl w:val="BB321F4A"/>
@@ -3577,7 +5014,7 @@
       </w:pPr>
     </w:lvl>
   </w:abstractNum>
-  <w:abstractNum w:abstractNumId="13" w15:restartNumberingAfterBreak="0">
+  <w:abstractNum w:abstractNumId="18" w15:restartNumberingAfterBreak="0">
     <w:nsid w:val="35F10F2F"/>
     <w:multiLevelType w:val="multilevel"/>
     <w:tmpl w:val="660C497C"/>
@@ -3726,7 +5163,7 @@
       </w:rPr>
     </w:lvl>
   </w:abstractNum>
-  <w:abstractNum w:abstractNumId="14" w15:restartNumberingAfterBreak="0">
+  <w:abstractNum w:abstractNumId="19" w15:restartNumberingAfterBreak="0">
     <w:nsid w:val="3A602F44"/>
     <w:multiLevelType w:val="multilevel"/>
     <w:tmpl w:val="F26829E8"/>
@@ -3839,7 +5276,7 @@
       </w:pPr>
     </w:lvl>
   </w:abstractNum>
-  <w:abstractNum w:abstractNumId="15" w15:restartNumberingAfterBreak="0">
+  <w:abstractNum w:abstractNumId="20" w15:restartNumberingAfterBreak="0">
     <w:nsid w:val="3CDA3A16"/>
     <w:multiLevelType w:val="multilevel"/>
     <w:tmpl w:val="1E7E45CE"/>
@@ -3988,7 +5425,7 @@
       </w:rPr>
     </w:lvl>
   </w:abstractNum>
-  <w:abstractNum w:abstractNumId="16" w15:restartNumberingAfterBreak="0">
+  <w:abstractNum w:abstractNumId="21" w15:restartNumberingAfterBreak="0">
     <w:nsid w:val="3EDA6CDB"/>
     <w:multiLevelType w:val="multilevel"/>
     <w:tmpl w:val="955EB7BA"/>
@@ -4101,7 +5538,156 @@
       </w:pPr>
     </w:lvl>
   </w:abstractNum>
-  <w:abstractNum w:abstractNumId="17" w15:restartNumberingAfterBreak="0">
+  <w:abstractNum w:abstractNumId="22" w15:restartNumberingAfterBreak="0">
+    <w:nsid w:val="3F655320"/>
+    <w:multiLevelType w:val="multilevel"/>
+    <w:tmpl w:val="706090E6"/>
+    <w:lvl w:ilvl="0">
+      <w:start w:val="1"/>
+      <w:numFmt w:val="bullet"/>
+      <w:lvlText w:val=""/>
+      <w:lvlJc w:val="left"/>
+      <w:pPr>
+        <w:tabs>
+          <w:tab w:val="num" w:pos="720"/>
+        </w:tabs>
+        <w:ind w:left="720" w:hanging="360"/>
+      </w:pPr>
+      <w:rPr>
+        <w:rFonts w:ascii="Symbol" w:hAnsi="Symbol" w:hint="default"/>
+        <w:sz w:val="20"/>
+      </w:rPr>
+    </w:lvl>
+    <w:lvl w:ilvl="1">
+      <w:start w:val="1"/>
+      <w:numFmt w:val="bullet"/>
+      <w:lvlText w:val=""/>
+      <w:lvlJc w:val="left"/>
+      <w:pPr>
+        <w:tabs>
+          <w:tab w:val="num" w:pos="1440"/>
+        </w:tabs>
+        <w:ind w:left="1440" w:hanging="360"/>
+      </w:pPr>
+      <w:rPr>
+        <w:rFonts w:ascii="Symbol" w:hAnsi="Symbol" w:hint="default"/>
+        <w:sz w:val="20"/>
+      </w:rPr>
+    </w:lvl>
+    <w:lvl w:ilvl="2" w:tentative="1">
+      <w:start w:val="1"/>
+      <w:numFmt w:val="bullet"/>
+      <w:lvlText w:val=""/>
+      <w:lvlJc w:val="left"/>
+      <w:pPr>
+        <w:tabs>
+          <w:tab w:val="num" w:pos="2160"/>
+        </w:tabs>
+        <w:ind w:left="2160" w:hanging="360"/>
+      </w:pPr>
+      <w:rPr>
+        <w:rFonts w:ascii="Symbol" w:hAnsi="Symbol" w:hint="default"/>
+        <w:sz w:val="20"/>
+      </w:rPr>
+    </w:lvl>
+    <w:lvl w:ilvl="3" w:tentative="1">
+      <w:start w:val="1"/>
+      <w:numFmt w:val="bullet"/>
+      <w:lvlText w:val=""/>
+      <w:lvlJc w:val="left"/>
+      <w:pPr>
+        <w:tabs>
+          <w:tab w:val="num" w:pos="2880"/>
+        </w:tabs>
+        <w:ind w:left="2880" w:hanging="360"/>
+      </w:pPr>
+      <w:rPr>
+        <w:rFonts w:ascii="Symbol" w:hAnsi="Symbol" w:hint="default"/>
+        <w:sz w:val="20"/>
+      </w:rPr>
+    </w:lvl>
+    <w:lvl w:ilvl="4" w:tentative="1">
+      <w:start w:val="1"/>
+      <w:numFmt w:val="bullet"/>
+      <w:lvlText w:val=""/>
+      <w:lvlJc w:val="left"/>
+      <w:pPr>
+        <w:tabs>
+          <w:tab w:val="num" w:pos="3600"/>
+        </w:tabs>
+        <w:ind w:left="3600" w:hanging="360"/>
+      </w:pPr>
+      <w:rPr>
+        <w:rFonts w:ascii="Symbol" w:hAnsi="Symbol" w:hint="default"/>
+        <w:sz w:val="20"/>
+      </w:rPr>
+    </w:lvl>
+    <w:lvl w:ilvl="5" w:tentative="1">
+      <w:start w:val="1"/>
+      <w:numFmt w:val="bullet"/>
+      <w:lvlText w:val=""/>
+      <w:lvlJc w:val="left"/>
+      <w:pPr>
+        <w:tabs>
+          <w:tab w:val="num" w:pos="4320"/>
+        </w:tabs>
+        <w:ind w:left="4320" w:hanging="360"/>
+      </w:pPr>
+      <w:rPr>
+        <w:rFonts w:ascii="Symbol" w:hAnsi="Symbol" w:hint="default"/>
+        <w:sz w:val="20"/>
+      </w:rPr>
+    </w:lvl>
+    <w:lvl w:ilvl="6" w:tentative="1">
+      <w:start w:val="1"/>
+      <w:numFmt w:val="bullet"/>
+      <w:lvlText w:val=""/>
+      <w:lvlJc w:val="left"/>
+      <w:pPr>
+        <w:tabs>
+          <w:tab w:val="num" w:pos="5040"/>
+        </w:tabs>
+        <w:ind w:left="5040" w:hanging="360"/>
+      </w:pPr>
+      <w:rPr>
+        <w:rFonts w:ascii="Symbol" w:hAnsi="Symbol" w:hint="default"/>
+        <w:sz w:val="20"/>
+      </w:rPr>
+    </w:lvl>
+    <w:lvl w:ilvl="7" w:tentative="1">
+      <w:start w:val="1"/>
+      <w:numFmt w:val="bullet"/>
+      <w:lvlText w:val=""/>
+      <w:lvlJc w:val="left"/>
+      <w:pPr>
+        <w:tabs>
+          <w:tab w:val="num" w:pos="5760"/>
+        </w:tabs>
+        <w:ind w:left="5760" w:hanging="360"/>
+      </w:pPr>
+      <w:rPr>
+        <w:rFonts w:ascii="Symbol" w:hAnsi="Symbol" w:hint="default"/>
+        <w:sz w:val="20"/>
+      </w:rPr>
+    </w:lvl>
+    <w:lvl w:ilvl="8" w:tentative="1">
+      <w:start w:val="1"/>
+      <w:numFmt w:val="bullet"/>
+      <w:lvlText w:val=""/>
+      <w:lvlJc w:val="left"/>
+      <w:pPr>
+        <w:tabs>
+          <w:tab w:val="num" w:pos="6480"/>
+        </w:tabs>
+        <w:ind w:left="6480" w:hanging="360"/>
+      </w:pPr>
+      <w:rPr>
+        <w:rFonts w:ascii="Symbol" w:hAnsi="Symbol" w:hint="default"/>
+        <w:sz w:val="20"/>
+      </w:rPr>
+    </w:lvl>
+  </w:abstractNum>
+  <w:abstractNum w:abstractNumId="23" w15:restartNumberingAfterBreak="0">
     <w:nsid w:val="40F071A4"/>
     <w:multiLevelType w:val="multilevel"/>
     <w:tmpl w:val="D43A710A"/>
@@ -4214,7 +5800,7 @@
       </w:pPr>
     </w:lvl>
   </w:abstractNum>
-  <w:abstractNum w:abstractNumId="18" w15:restartNumberingAfterBreak="0">
+  <w:abstractNum w:abstractNumId="24" w15:restartNumberingAfterBreak="0">
     <w:nsid w:val="43031C31"/>
     <w:multiLevelType w:val="multilevel"/>
     <w:tmpl w:val="875A1E00"/>
@@ -4363,7 +5949,7 @@
       </w:rPr>
     </w:lvl>
   </w:abstractNum>
-  <w:abstractNum w:abstractNumId="19" w15:restartNumberingAfterBreak="0">
+  <w:abstractNum w:abstractNumId="25" w15:restartNumberingAfterBreak="0">
     <w:nsid w:val="44C15778"/>
     <w:multiLevelType w:val="multilevel"/>
     <w:tmpl w:val="BF8CDEC8"/>
@@ -4512,7 +6098,156 @@
       </w:rPr>
     </w:lvl>
   </w:abstractNum>
-  <w:abstractNum w:abstractNumId="20" w15:restartNumberingAfterBreak="0">
+  <w:abstractNum w:abstractNumId="26" w15:restartNumberingAfterBreak="0">
+    <w:nsid w:val="49C675B6"/>
+    <w:multiLevelType w:val="multilevel"/>
+    <w:tmpl w:val="3BB26E22"/>
+    <w:lvl w:ilvl="0">
+      <w:start w:val="1"/>
+      <w:numFmt w:val="bullet"/>
+      <w:lvlText w:val=""/>
+      <w:lvlJc w:val="left"/>
+      <w:pPr>
+        <w:tabs>
+          <w:tab w:val="num" w:pos="720"/>
+        </w:tabs>
+        <w:ind w:left="720" w:hanging="360"/>
+      </w:pPr>
+      <w:rPr>
+        <w:rFonts w:ascii="Symbol" w:hAnsi="Symbol" w:hint="default"/>
+        <w:sz w:val="20"/>
+      </w:rPr>
+    </w:lvl>
+    <w:lvl w:ilvl="1" w:tentative="1">
+      <w:start w:val="1"/>
+      <w:numFmt w:val="bullet"/>
+      <w:lvlText w:val=""/>
+      <w:lvlJc w:val="left"/>
+      <w:pPr>
+        <w:tabs>
+          <w:tab w:val="num" w:pos="1440"/>
+        </w:tabs>
+        <w:ind w:left="1440" w:hanging="360"/>
+      </w:pPr>
+      <w:rPr>
+        <w:rFonts w:ascii="Symbol" w:hAnsi="Symbol" w:hint="default"/>
+        <w:sz w:val="20"/>
+      </w:rPr>
+    </w:lvl>
+    <w:lvl w:ilvl="2" w:tentative="1">
+      <w:start w:val="1"/>
+      <w:numFmt w:val="bullet"/>
+      <w:lvlText w:val=""/>
+      <w:lvlJc w:val="left"/>
+      <w:pPr>
+        <w:tabs>
+          <w:tab w:val="num" w:pos="2160"/>
+        </w:tabs>
+        <w:ind w:left="2160" w:hanging="360"/>
+      </w:pPr>
+      <w:rPr>
+        <w:rFonts w:ascii="Symbol" w:hAnsi="Symbol" w:hint="default"/>
+        <w:sz w:val="20"/>
+      </w:rPr>
+    </w:lvl>
+    <w:lvl w:ilvl="3" w:tentative="1">
+      <w:start w:val="1"/>
+      <w:numFmt w:val="bullet"/>
+      <w:lvlText w:val=""/>
+      <w:lvlJc w:val="left"/>
+      <w:pPr>
+        <w:tabs>
+          <w:tab w:val="num" w:pos="2880"/>
+        </w:tabs>
+        <w:ind w:left="2880" w:hanging="360"/>
+      </w:pPr>
+      <w:rPr>
+        <w:rFonts w:ascii="Symbol" w:hAnsi="Symbol" w:hint="default"/>
+        <w:sz w:val="20"/>
+      </w:rPr>
+    </w:lvl>
+    <w:lvl w:ilvl="4" w:tentative="1">
+      <w:start w:val="1"/>
+      <w:numFmt w:val="bullet"/>
+      <w:lvlText w:val=""/>
+      <w:lvlJc w:val="left"/>
+      <w:pPr>
+        <w:tabs>
+          <w:tab w:val="num" w:pos="3600"/>
+        </w:tabs>
+        <w:ind w:left="3600" w:hanging="360"/>
+      </w:pPr>
+      <w:rPr>
+        <w:rFonts w:ascii="Symbol" w:hAnsi="Symbol" w:hint="default"/>
+        <w:sz w:val="20"/>
+      </w:rPr>
+    </w:lvl>
+    <w:lvl w:ilvl="5" w:tentative="1">
+      <w:start w:val="1"/>
+      <w:numFmt w:val="bullet"/>
+      <w:lvlText w:val=""/>
+      <w:lvlJc w:val="left"/>
+      <w:pPr>
+        <w:tabs>
+          <w:tab w:val="num" w:pos="4320"/>
+        </w:tabs>
+        <w:ind w:left="4320" w:hanging="360"/>
+      </w:pPr>
+      <w:rPr>
+        <w:rFonts w:ascii="Symbol" w:hAnsi="Symbol" w:hint="default"/>
+        <w:sz w:val="20"/>
+      </w:rPr>
+    </w:lvl>
+    <w:lvl w:ilvl="6" w:tentative="1">
+      <w:start w:val="1"/>
+      <w:numFmt w:val="bullet"/>
+      <w:lvlText w:val=""/>
+      <w:lvlJc w:val="left"/>
+      <w:pPr>
+        <w:tabs>
+          <w:tab w:val="num" w:pos="5040"/>
+        </w:tabs>
+        <w:ind w:left="5040" w:hanging="360"/>
+      </w:pPr>
+      <w:rPr>
+        <w:rFonts w:ascii="Symbol" w:hAnsi="Symbol" w:hint="default"/>
+        <w:sz w:val="20"/>
+      </w:rPr>
+    </w:lvl>
+    <w:lvl w:ilvl="7" w:tentative="1">
+      <w:start w:val="1"/>
+      <w:numFmt w:val="bullet"/>
+      <w:lvlText w:val=""/>
+      <w:lvlJc w:val="left"/>
+      <w:pPr>
+        <w:tabs>
+          <w:tab w:val="num" w:pos="5760"/>
+        </w:tabs>
+        <w:ind w:left="5760" w:hanging="360"/>
+      </w:pPr>
+      <w:rPr>
+        <w:rFonts w:ascii="Symbol" w:hAnsi="Symbol" w:hint="default"/>
+        <w:sz w:val="20"/>
+      </w:rPr>
+    </w:lvl>
+    <w:lvl w:ilvl="8" w:tentative="1">
+      <w:start w:val="1"/>
+      <w:numFmt w:val="bullet"/>
+      <w:lvlText w:val=""/>
+      <w:lvlJc w:val="left"/>
+      <w:pPr>
+        <w:tabs>
+          <w:tab w:val="num" w:pos="6480"/>
+        </w:tabs>
+        <w:ind w:left="6480" w:hanging="360"/>
+      </w:pPr>
+      <w:rPr>
+        <w:rFonts w:ascii="Symbol" w:hAnsi="Symbol" w:hint="default"/>
+        <w:sz w:val="20"/>
+      </w:rPr>
+    </w:lvl>
+  </w:abstractNum>
+  <w:abstractNum w:abstractNumId="27" w15:restartNumberingAfterBreak="0">
     <w:nsid w:val="4C6C1A63"/>
     <w:multiLevelType w:val="multilevel"/>
     <w:tmpl w:val="E9E467C4"/>
@@ -4661,7 +6396,7 @@
       </w:rPr>
     </w:lvl>
   </w:abstractNum>
-  <w:abstractNum w:abstractNumId="21" w15:restartNumberingAfterBreak="0">
+  <w:abstractNum w:abstractNumId="28" w15:restartNumberingAfterBreak="0">
     <w:nsid w:val="4DFD395E"/>
     <w:multiLevelType w:val="multilevel"/>
     <w:tmpl w:val="F67C9E10"/>
@@ -4810,7 +6545,156 @@
       </w:rPr>
     </w:lvl>
   </w:abstractNum>
-  <w:abstractNum w:abstractNumId="22" w15:restartNumberingAfterBreak="0">
+  <w:abstractNum w:abstractNumId="29" w15:restartNumberingAfterBreak="0">
+    <w:nsid w:val="4E055FF3"/>
+    <w:multiLevelType w:val="multilevel"/>
+    <w:tmpl w:val="66ECE502"/>
+    <w:lvl w:ilvl="0">
+      <w:start w:val="1"/>
+      <w:numFmt w:val="bullet"/>
+      <w:lvlText w:val=""/>
+      <w:lvlJc w:val="left"/>
+      <w:pPr>
+        <w:tabs>
+          <w:tab w:val="num" w:pos="720"/>
+        </w:tabs>
+        <w:ind w:left="720" w:hanging="360"/>
+      </w:pPr>
+      <w:rPr>
+        <w:rFonts w:ascii="Symbol" w:hAnsi="Symbol" w:hint="default"/>
+        <w:sz w:val="20"/>
+      </w:rPr>
+    </w:lvl>
+    <w:lvl w:ilvl="1" w:tentative="1">
+      <w:start w:val="1"/>
+      <w:numFmt w:val="bullet"/>
+      <w:lvlText w:val=""/>
+      <w:lvlJc w:val="left"/>
+      <w:pPr>
+        <w:tabs>
+          <w:tab w:val="num" w:pos="1440"/>
+        </w:tabs>
+        <w:ind w:left="1440" w:hanging="360"/>
+      </w:pPr>
+      <w:rPr>
+        <w:rFonts w:ascii="Symbol" w:hAnsi="Symbol" w:hint="default"/>
+        <w:sz w:val="20"/>
+      </w:rPr>
+    </w:lvl>
+    <w:lvl w:ilvl="2" w:tentative="1">
+      <w:start w:val="1"/>
+      <w:numFmt w:val="bullet"/>
+      <w:lvlText w:val=""/>
+      <w:lvlJc w:val="left"/>
+      <w:pPr>
+        <w:tabs>
+          <w:tab w:val="num" w:pos="2160"/>
+        </w:tabs>
+        <w:ind w:left="2160" w:hanging="360"/>
+      </w:pPr>
+      <w:rPr>
+        <w:rFonts w:ascii="Symbol" w:hAnsi="Symbol" w:hint="default"/>
+        <w:sz w:val="20"/>
+      </w:rPr>
+    </w:lvl>
+    <w:lvl w:ilvl="3" w:tentative="1">
+      <w:start w:val="1"/>
+      <w:numFmt w:val="bullet"/>
+      <w:lvlText w:val=""/>
+      <w:lvlJc w:val="left"/>
+      <w:pPr>
+        <w:tabs>
+          <w:tab w:val="num" w:pos="2880"/>
+        </w:tabs>
+        <w:ind w:left="2880" w:hanging="360"/>
+      </w:pPr>
+      <w:rPr>
+        <w:rFonts w:ascii="Symbol" w:hAnsi="Symbol" w:hint="default"/>
+        <w:sz w:val="20"/>
+      </w:rPr>
+    </w:lvl>
+    <w:lvl w:ilvl="4" w:tentative="1">
+      <w:start w:val="1"/>
+      <w:numFmt w:val="bullet"/>
+      <w:lvlText w:val=""/>
+      <w:lvlJc w:val="left"/>
+      <w:pPr>
+        <w:tabs>
+          <w:tab w:val="num" w:pos="3600"/>
+        </w:tabs>
+        <w:ind w:left="3600" w:hanging="360"/>
+      </w:pPr>
+      <w:rPr>
+        <w:rFonts w:ascii="Symbol" w:hAnsi="Symbol" w:hint="default"/>
+        <w:sz w:val="20"/>
+      </w:rPr>
+    </w:lvl>
+    <w:lvl w:ilvl="5" w:tentative="1">
+      <w:start w:val="1"/>
+      <w:numFmt w:val="bullet"/>
+      <w:lvlText w:val=""/>
+      <w:lvlJc w:val="left"/>
+      <w:pPr>
+        <w:tabs>
+          <w:tab w:val="num" w:pos="4320"/>
+        </w:tabs>
+        <w:ind w:left="4320" w:hanging="360"/>
+      </w:pPr>
+      <w:rPr>
+        <w:rFonts w:ascii="Symbol" w:hAnsi="Symbol" w:hint="default"/>
+        <w:sz w:val="20"/>
+      </w:rPr>
+    </w:lvl>
+    <w:lvl w:ilvl="6" w:tentative="1">
+      <w:start w:val="1"/>
+      <w:numFmt w:val="bullet"/>
+      <w:lvlText w:val=""/>
+      <w:lvlJc w:val="left"/>
+      <w:pPr>
+        <w:tabs>
+          <w:tab w:val="num" w:pos="5040"/>
+        </w:tabs>
+        <w:ind w:left="5040" w:hanging="360"/>
+      </w:pPr>
+      <w:rPr>
+        <w:rFonts w:ascii="Symbol" w:hAnsi="Symbol" w:hint="default"/>
+        <w:sz w:val="20"/>
+      </w:rPr>
+    </w:lvl>
+    <w:lvl w:ilvl="7" w:tentative="1">
+      <w:start w:val="1"/>
+      <w:numFmt w:val="bullet"/>
+      <w:lvlText w:val=""/>
+      <w:lvlJc w:val="left"/>
+      <w:pPr>
+        <w:tabs>
+          <w:tab w:val="num" w:pos="5760"/>
+        </w:tabs>
+        <w:ind w:left="5760" w:hanging="360"/>
+      </w:pPr>
+      <w:rPr>
+        <w:rFonts w:ascii="Symbol" w:hAnsi="Symbol" w:hint="default"/>
+        <w:sz w:val="20"/>
+      </w:rPr>
+    </w:lvl>
+    <w:lvl w:ilvl="8" w:tentative="1">
+      <w:start w:val="1"/>
+      <w:numFmt w:val="bullet"/>
+      <w:lvlText w:val=""/>
+      <w:lvlJc w:val="left"/>
+      <w:pPr>
+        <w:tabs>
+          <w:tab w:val="num" w:pos="6480"/>
+        </w:tabs>
+        <w:ind w:left="6480" w:hanging="360"/>
+      </w:pPr>
+      <w:rPr>
+        <w:rFonts w:ascii="Symbol" w:hAnsi="Symbol" w:hint="default"/>
+        <w:sz w:val="20"/>
+      </w:rPr>
+    </w:lvl>
+  </w:abstractNum>
+  <w:abstractNum w:abstractNumId="30" w15:restartNumberingAfterBreak="0">
     <w:nsid w:val="4FC63185"/>
     <w:multiLevelType w:val="multilevel"/>
     <w:tmpl w:val="06B6EE48"/>
@@ -4959,7 +6843,7 @@
       </w:rPr>
     </w:lvl>
   </w:abstractNum>
-  <w:abstractNum w:abstractNumId="23" w15:restartNumberingAfterBreak="0">
+  <w:abstractNum w:abstractNumId="31" w15:restartNumberingAfterBreak="0">
     <w:nsid w:val="4FCC1DCB"/>
     <w:multiLevelType w:val="multilevel"/>
     <w:tmpl w:val="79F08558"/>
@@ -5108,7 +6992,7 @@
       </w:rPr>
     </w:lvl>
   </w:abstractNum>
-  <w:abstractNum w:abstractNumId="24" w15:restartNumberingAfterBreak="0">
+  <w:abstractNum w:abstractNumId="32" w15:restartNumberingAfterBreak="0">
     <w:nsid w:val="51683DE1"/>
     <w:multiLevelType w:val="multilevel"/>
     <w:tmpl w:val="3D229C78"/>
@@ -5221,7 +7105,7 @@
       </w:pPr>
     </w:lvl>
   </w:abstractNum>
-  <w:abstractNum w:abstractNumId="25" w15:restartNumberingAfterBreak="0">
+  <w:abstractNum w:abstractNumId="33" w15:restartNumberingAfterBreak="0">
     <w:nsid w:val="5407469B"/>
     <w:multiLevelType w:val="multilevel"/>
     <w:tmpl w:val="C600752A"/>
@@ -5370,7 +7254,305 @@
       </w:rPr>
     </w:lvl>
   </w:abstractNum>
-  <w:abstractNum w:abstractNumId="26" w15:restartNumberingAfterBreak="0">
+  <w:abstractNum w:abstractNumId="34" w15:restartNumberingAfterBreak="0">
+    <w:nsid w:val="5E576741"/>
+    <w:multiLevelType w:val="multilevel"/>
+    <w:tmpl w:val="0E58C418"/>
+    <w:lvl w:ilvl="0">
+      <w:start w:val="1"/>
+      <w:numFmt w:val="bullet"/>
+      <w:lvlText w:val=""/>
+      <w:lvlJc w:val="left"/>
+      <w:pPr>
+        <w:tabs>
+          <w:tab w:val="num" w:pos="720"/>
+        </w:tabs>
+        <w:ind w:left="720" w:hanging="360"/>
+      </w:pPr>
+      <w:rPr>
+        <w:rFonts w:ascii="Symbol" w:hAnsi="Symbol" w:hint="default"/>
+        <w:sz w:val="20"/>
+      </w:rPr>
+    </w:lvl>
+    <w:lvl w:ilvl="1" w:tentative="1">
+      <w:start w:val="1"/>
+      <w:numFmt w:val="bullet"/>
+      <w:lvlText w:val=""/>
+      <w:lvlJc w:val="left"/>
+      <w:pPr>
+        <w:tabs>
+          <w:tab w:val="num" w:pos="1440"/>
+        </w:tabs>
+        <w:ind w:left="1440" w:hanging="360"/>
+      </w:pPr>
+      <w:rPr>
+        <w:rFonts w:ascii="Symbol" w:hAnsi="Symbol" w:hint="default"/>
+        <w:sz w:val="20"/>
+      </w:rPr>
+    </w:lvl>
+    <w:lvl w:ilvl="2" w:tentative="1">
+      <w:start w:val="1"/>
+      <w:numFmt w:val="bullet"/>
+      <w:lvlText w:val=""/>
+      <w:lvlJc w:val="left"/>
+      <w:pPr>
+        <w:tabs>
+          <w:tab w:val="num" w:pos="2160"/>
+        </w:tabs>
+        <w:ind w:left="2160" w:hanging="360"/>
+      </w:pPr>
+      <w:rPr>
+        <w:rFonts w:ascii="Symbol" w:hAnsi="Symbol" w:hint="default"/>
+        <w:sz w:val="20"/>
+      </w:rPr>
+    </w:lvl>
+    <w:lvl w:ilvl="3" w:tentative="1">
+      <w:start w:val="1"/>
+      <w:numFmt w:val="bullet"/>
+      <w:lvlText w:val=""/>
+      <w:lvlJc w:val="left"/>
+      <w:pPr>
+        <w:tabs>
+          <w:tab w:val="num" w:pos="2880"/>
+        </w:tabs>
+        <w:ind w:left="2880" w:hanging="360"/>
+      </w:pPr>
+      <w:rPr>
+        <w:rFonts w:ascii="Symbol" w:hAnsi="Symbol" w:hint="default"/>
+        <w:sz w:val="20"/>
+      </w:rPr>
+    </w:lvl>
+    <w:lvl w:ilvl="4" w:tentative="1">
+      <w:start w:val="1"/>
+      <w:numFmt w:val="bullet"/>
+      <w:lvlText w:val=""/>
+      <w:lvlJc w:val="left"/>
+      <w:pPr>
+        <w:tabs>
+          <w:tab w:val="num" w:pos="3600"/>
+        </w:tabs>
+        <w:ind w:left="3600" w:hanging="360"/>
+      </w:pPr>
+      <w:rPr>
+        <w:rFonts w:ascii="Symbol" w:hAnsi="Symbol" w:hint="default"/>
+        <w:sz w:val="20"/>
+      </w:rPr>
+    </w:lvl>
+    <w:lvl w:ilvl="5" w:tentative="1">
+      <w:start w:val="1"/>
+      <w:numFmt w:val="bullet"/>
+      <w:lvlText w:val=""/>
+      <w:lvlJc w:val="left"/>
+      <w:pPr>
+        <w:tabs>
+          <w:tab w:val="num" w:pos="4320"/>
+        </w:tabs>
+        <w:ind w:left="4320" w:hanging="360"/>
+      </w:pPr>
+      <w:rPr>
+        <w:rFonts w:ascii="Symbol" w:hAnsi="Symbol" w:hint="default"/>
+        <w:sz w:val="20"/>
+      </w:rPr>
+    </w:lvl>
+    <w:lvl w:ilvl="6" w:tentative="1">
+      <w:start w:val="1"/>
+      <w:numFmt w:val="bullet"/>
+      <w:lvlText w:val=""/>
+      <w:lvlJc w:val="left"/>
+      <w:pPr>
+        <w:tabs>
+          <w:tab w:val="num" w:pos="5040"/>
+        </w:tabs>
+        <w:ind w:left="5040" w:hanging="360"/>
+      </w:pPr>
+      <w:rPr>
+        <w:rFonts w:ascii="Symbol" w:hAnsi="Symbol" w:hint="default"/>
+        <w:sz w:val="20"/>
+      </w:rPr>
+    </w:lvl>
+    <w:lvl w:ilvl="7" w:tentative="1">
+      <w:start w:val="1"/>
+      <w:numFmt w:val="bullet"/>
+      <w:lvlText w:val=""/>
+      <w:lvlJc w:val="left"/>
+      <w:pPr>
+        <w:tabs>
+          <w:tab w:val="num" w:pos="5760"/>
+        </w:tabs>
+        <w:ind w:left="5760" w:hanging="360"/>
+      </w:pPr>
+      <w:rPr>
+        <w:rFonts w:ascii="Symbol" w:hAnsi="Symbol" w:hint="default"/>
+        <w:sz w:val="20"/>
+      </w:rPr>
+    </w:lvl>
+    <w:lvl w:ilvl="8" w:tentative="1">
+      <w:start w:val="1"/>
+      <w:numFmt w:val="bullet"/>
+      <w:lvlText w:val=""/>
+      <w:lvlJc w:val="left"/>
+      <w:pPr>
+        <w:tabs>
+          <w:tab w:val="num" w:pos="6480"/>
+        </w:tabs>
+        <w:ind w:left="6480" w:hanging="360"/>
+      </w:pPr>
+      <w:rPr>
+        <w:rFonts w:ascii="Symbol" w:hAnsi="Symbol" w:hint="default"/>
+        <w:sz w:val="20"/>
+      </w:rPr>
+    </w:lvl>
+  </w:abstractNum>
+  <w:abstractNum w:abstractNumId="35" w15:restartNumberingAfterBreak="0">
+    <w:nsid w:val="6CB65F7B"/>
+    <w:multiLevelType w:val="multilevel"/>
+    <w:tmpl w:val="653657EA"/>
+    <w:lvl w:ilvl="0">
+      <w:start w:val="1"/>
+      <w:numFmt w:val="bullet"/>
+      <w:lvlText w:val=""/>
+      <w:lvlJc w:val="left"/>
+      <w:pPr>
+        <w:tabs>
+          <w:tab w:val="num" w:pos="720"/>
+        </w:tabs>
+        <w:ind w:left="720" w:hanging="360"/>
+      </w:pPr>
+      <w:rPr>
+        <w:rFonts w:ascii="Symbol" w:hAnsi="Symbol" w:hint="default"/>
+        <w:sz w:val="20"/>
+      </w:rPr>
+    </w:lvl>
+    <w:lvl w:ilvl="1" w:tentative="1">
+      <w:start w:val="1"/>
+      <w:numFmt w:val="bullet"/>
+      <w:lvlText w:val=""/>
+      <w:lvlJc w:val="left"/>
+      <w:pPr>
+        <w:tabs>
+          <w:tab w:val="num" w:pos="1440"/>
+        </w:tabs>
+        <w:ind w:left="1440" w:hanging="360"/>
+      </w:pPr>
+      <w:rPr>
+        <w:rFonts w:ascii="Symbol" w:hAnsi="Symbol" w:hint="default"/>
+        <w:sz w:val="20"/>
+      </w:rPr>
+    </w:lvl>
+    <w:lvl w:ilvl="2" w:tentative="1">
+      <w:start w:val="1"/>
+      <w:numFmt w:val="bullet"/>
+      <w:lvlText w:val=""/>
+      <w:lvlJc w:val="left"/>
+      <w:pPr>
+        <w:tabs>
+          <w:tab w:val="num" w:pos="2160"/>
+        </w:tabs>
+        <w:ind w:left="2160" w:hanging="360"/>
+      </w:pPr>
+      <w:rPr>
+        <w:rFonts w:ascii="Symbol" w:hAnsi="Symbol" w:hint="default"/>
+        <w:sz w:val="20"/>
+      </w:rPr>
+    </w:lvl>
+    <w:lvl w:ilvl="3" w:tentative="1">
+      <w:start w:val="1"/>
+      <w:numFmt w:val="bullet"/>
+      <w:lvlText w:val=""/>
+      <w:lvlJc w:val="left"/>
+      <w:pPr>
+        <w:tabs>
+          <w:tab w:val="num" w:pos="2880"/>
+        </w:tabs>
+        <w:ind w:left="2880" w:hanging="360"/>
+      </w:pPr>
+      <w:rPr>
+        <w:rFonts w:ascii="Symbol" w:hAnsi="Symbol" w:hint="default"/>
+        <w:sz w:val="20"/>
+      </w:rPr>
+    </w:lvl>
+    <w:lvl w:ilvl="4" w:tentative="1">
+      <w:start w:val="1"/>
+      <w:numFmt w:val="bullet"/>
+      <w:lvlText w:val=""/>
+      <w:lvlJc w:val="left"/>
+      <w:pPr>
+        <w:tabs>
+          <w:tab w:val="num" w:pos="3600"/>
+        </w:tabs>
+        <w:ind w:left="3600" w:hanging="360"/>
+      </w:pPr>
+      <w:rPr>
+        <w:rFonts w:ascii="Symbol" w:hAnsi="Symbol" w:hint="default"/>
+        <w:sz w:val="20"/>
+      </w:rPr>
+    </w:lvl>
+    <w:lvl w:ilvl="5" w:tentative="1">
+      <w:start w:val="1"/>
+      <w:numFmt w:val="bullet"/>
+      <w:lvlText w:val=""/>
+      <w:lvlJc w:val="left"/>
+      <w:pPr>
+        <w:tabs>
+          <w:tab w:val="num" w:pos="4320"/>
+        </w:tabs>
+        <w:ind w:left="4320" w:hanging="360"/>
+      </w:pPr>
+      <w:rPr>
+        <w:rFonts w:ascii="Symbol" w:hAnsi="Symbol" w:hint="default"/>
+        <w:sz w:val="20"/>
+      </w:rPr>
+    </w:lvl>
+    <w:lvl w:ilvl="6" w:tentative="1">
+      <w:start w:val="1"/>
+      <w:numFmt w:val="bullet"/>
+      <w:lvlText w:val=""/>
+      <w:lvlJc w:val="left"/>
+      <w:pPr>
+        <w:tabs>
+          <w:tab w:val="num" w:pos="5040"/>
+        </w:tabs>
+        <w:ind w:left="5040" w:hanging="360"/>
+      </w:pPr>
+      <w:rPr>
+        <w:rFonts w:ascii="Symbol" w:hAnsi="Symbol" w:hint="default"/>
+        <w:sz w:val="20"/>
+      </w:rPr>
+    </w:lvl>
+    <w:lvl w:ilvl="7" w:tentative="1">
+      <w:start w:val="1"/>
+      <w:numFmt w:val="bullet"/>
+      <w:lvlText w:val=""/>
+      <w:lvlJc w:val="left"/>
+      <w:pPr>
+        <w:tabs>
+          <w:tab w:val="num" w:pos="5760"/>
+        </w:tabs>
+        <w:ind w:left="5760" w:hanging="360"/>
+      </w:pPr>
+      <w:rPr>
+        <w:rFonts w:ascii="Symbol" w:hAnsi="Symbol" w:hint="default"/>
+        <w:sz w:val="20"/>
+      </w:rPr>
+    </w:lvl>
+    <w:lvl w:ilvl="8" w:tentative="1">
+      <w:start w:val="1"/>
+      <w:numFmt w:val="bullet"/>
+      <w:lvlText w:val=""/>
+      <w:lvlJc w:val="left"/>
+      <w:pPr>
+        <w:tabs>
+          <w:tab w:val="num" w:pos="6480"/>
+        </w:tabs>
+        <w:ind w:left="6480" w:hanging="360"/>
+      </w:pPr>
+      <w:rPr>
+        <w:rFonts w:ascii="Symbol" w:hAnsi="Symbol" w:hint="default"/>
+        <w:sz w:val="20"/>
+      </w:rPr>
+    </w:lvl>
+  </w:abstractNum>
+  <w:abstractNum w:abstractNumId="36" w15:restartNumberingAfterBreak="0">
     <w:nsid w:val="6D5D62B7"/>
     <w:multiLevelType w:val="multilevel"/>
     <w:tmpl w:val="C3B482F8"/>
@@ -5519,7 +7701,7 @@
       </w:rPr>
     </w:lvl>
   </w:abstractNum>
-  <w:abstractNum w:abstractNumId="27" w15:restartNumberingAfterBreak="0">
+  <w:abstractNum w:abstractNumId="37" w15:restartNumberingAfterBreak="0">
     <w:nsid w:val="72587385"/>
     <w:multiLevelType w:val="multilevel"/>
     <w:tmpl w:val="318E920C"/>
@@ -5633,88 +7815,118 @@
     </w:lvl>
   </w:abstractNum>
   <w:num w:numId="1" w16cid:durableId="1774088991">
+    <w:abstractNumId w:val="14"/>
+  </w:num>
+  <w:num w:numId="2" w16cid:durableId="841042213">
+    <w:abstractNumId w:val="20"/>
+  </w:num>
+  <w:num w:numId="3" w16cid:durableId="458450392">
+    <w:abstractNumId w:val="25"/>
+  </w:num>
+  <w:num w:numId="4" w16cid:durableId="2145345416">
+    <w:abstractNumId w:val="36"/>
+  </w:num>
+  <w:num w:numId="5" w16cid:durableId="1689059659">
+    <w:abstractNumId w:val="12"/>
+  </w:num>
+  <w:num w:numId="6" w16cid:durableId="850067770">
+    <w:abstractNumId w:val="28"/>
+  </w:num>
+  <w:num w:numId="7" w16cid:durableId="901519854">
+    <w:abstractNumId w:val="18"/>
+  </w:num>
+  <w:num w:numId="8" w16cid:durableId="995258193">
+    <w:abstractNumId w:val="5"/>
+  </w:num>
+  <w:num w:numId="9" w16cid:durableId="593128174">
+    <w:abstractNumId w:val="32"/>
+  </w:num>
+  <w:num w:numId="10" w16cid:durableId="897784369">
+    <w:abstractNumId w:val="37"/>
+  </w:num>
+  <w:num w:numId="11" w16cid:durableId="1370689232">
+    <w:abstractNumId w:val="4"/>
+  </w:num>
+  <w:num w:numId="12" w16cid:durableId="189951528">
+    <w:abstractNumId w:val="3"/>
+  </w:num>
+  <w:num w:numId="13" w16cid:durableId="2019430968">
+    <w:abstractNumId w:val="15"/>
+  </w:num>
+  <w:num w:numId="14" w16cid:durableId="2061130065">
+    <w:abstractNumId w:val="11"/>
+  </w:num>
+  <w:num w:numId="15" w16cid:durableId="326906716">
+    <w:abstractNumId w:val="33"/>
+  </w:num>
+  <w:num w:numId="16" w16cid:durableId="720634431">
+    <w:abstractNumId w:val="7"/>
+  </w:num>
+  <w:num w:numId="17" w16cid:durableId="95945112">
+    <w:abstractNumId w:val="31"/>
+  </w:num>
+  <w:num w:numId="18" w16cid:durableId="867135476">
+    <w:abstractNumId w:val="27"/>
+  </w:num>
+  <w:num w:numId="19" w16cid:durableId="1256666406">
+    <w:abstractNumId w:val="16"/>
+  </w:num>
+  <w:num w:numId="20" w16cid:durableId="1197236849">
+    <w:abstractNumId w:val="10"/>
+  </w:num>
+  <w:num w:numId="21" w16cid:durableId="792941494">
+    <w:abstractNumId w:val="24"/>
+  </w:num>
+  <w:num w:numId="22" w16cid:durableId="79258204">
+    <w:abstractNumId w:val="30"/>
+  </w:num>
+  <w:num w:numId="23" w16cid:durableId="153449370">
+    <w:abstractNumId w:val="19"/>
+  </w:num>
+  <w:num w:numId="24" w16cid:durableId="1323851910">
+    <w:abstractNumId w:val="17"/>
+  </w:num>
+  <w:num w:numId="25" w16cid:durableId="375929399">
+    <w:abstractNumId w:val="23"/>
+  </w:num>
+  <w:num w:numId="26" w16cid:durableId="1628269296">
+    <w:abstractNumId w:val="6"/>
+  </w:num>
+  <w:num w:numId="27" w16cid:durableId="1989554593">
+    <w:abstractNumId w:val="21"/>
+  </w:num>
+  <w:num w:numId="28" w16cid:durableId="453328799">
+    <w:abstractNumId w:val="8"/>
+  </w:num>
+  <w:num w:numId="29" w16cid:durableId="776947692">
+    <w:abstractNumId w:val="22"/>
+  </w:num>
+  <w:num w:numId="30" w16cid:durableId="565259056">
+    <w:abstractNumId w:val="34"/>
+  </w:num>
+  <w:num w:numId="31" w16cid:durableId="217478818">
+    <w:abstractNumId w:val="1"/>
+  </w:num>
+  <w:num w:numId="32" w16cid:durableId="606273788">
+    <w:abstractNumId w:val="35"/>
+  </w:num>
+  <w:num w:numId="33" w16cid:durableId="1076825863">
+    <w:abstractNumId w:val="0"/>
+  </w:num>
+  <w:num w:numId="34" w16cid:durableId="1873418573">
+    <w:abstractNumId w:val="13"/>
+  </w:num>
+  <w:num w:numId="35" w16cid:durableId="269358381">
+    <w:abstractNumId w:val="29"/>
+  </w:num>
+  <w:num w:numId="36" w16cid:durableId="333843346">
     <w:abstractNumId w:val="9"/>
   </w:num>
-  <w:num w:numId="2" w16cid:durableId="841042213">
-    <w:abstractNumId w:val="15"/>
-  </w:num>
-  <w:num w:numId="3" w16cid:durableId="458450392">
-    <w:abstractNumId w:val="19"/>
-  </w:num>
-  <w:num w:numId="4" w16cid:durableId="2145345416">
-    <w:abstractNumId w:val="26"/>
-  </w:num>
-  <w:num w:numId="5" w16cid:durableId="1689059659">
-    <w:abstractNumId w:val="8"/>
-  </w:num>
-  <w:num w:numId="6" w16cid:durableId="850067770">
-    <w:abstractNumId w:val="21"/>
-  </w:num>
-  <w:num w:numId="7" w16cid:durableId="901519854">
-    <w:abstractNumId w:val="13"/>
-  </w:num>
-  <w:num w:numId="8" w16cid:durableId="995258193">
+  <w:num w:numId="37" w16cid:durableId="1416904239">
     <w:abstractNumId w:val="2"/>
   </w:num>
-  <w:num w:numId="9" w16cid:durableId="593128174">
-    <w:abstractNumId w:val="24"/>
-  </w:num>
-  <w:num w:numId="10" w16cid:durableId="897784369">
-    <w:abstractNumId w:val="27"/>
-  </w:num>
-  <w:num w:numId="11" w16cid:durableId="1370689232">
-    <w:abstractNumId w:val="1"/>
-  </w:num>
-  <w:num w:numId="12" w16cid:durableId="189951528">
-    <w:abstractNumId w:val="0"/>
-  </w:num>
-  <w:num w:numId="13" w16cid:durableId="2019430968">
-    <w:abstractNumId w:val="10"/>
-  </w:num>
-  <w:num w:numId="14" w16cid:durableId="2061130065">
-    <w:abstractNumId w:val="7"/>
-  </w:num>
-  <w:num w:numId="15" w16cid:durableId="326906716">
-    <w:abstractNumId w:val="25"/>
-  </w:num>
-  <w:num w:numId="16" w16cid:durableId="720634431">
-    <w:abstractNumId w:val="4"/>
-  </w:num>
-  <w:num w:numId="17" w16cid:durableId="95945112">
-    <w:abstractNumId w:val="23"/>
-  </w:num>
-  <w:num w:numId="18" w16cid:durableId="867135476">
-    <w:abstractNumId w:val="20"/>
-  </w:num>
-  <w:num w:numId="19" w16cid:durableId="1256666406">
-    <w:abstractNumId w:val="11"/>
-  </w:num>
-  <w:num w:numId="20" w16cid:durableId="1197236849">
-    <w:abstractNumId w:val="6"/>
-  </w:num>
-  <w:num w:numId="21" w16cid:durableId="792941494">
-    <w:abstractNumId w:val="18"/>
-  </w:num>
-  <w:num w:numId="22" w16cid:durableId="79258204">
-    <w:abstractNumId w:val="22"/>
-  </w:num>
-  <w:num w:numId="23" w16cid:durableId="153449370">
-    <w:abstractNumId w:val="14"/>
-  </w:num>
-  <w:num w:numId="24" w16cid:durableId="1323851910">
-    <w:abstractNumId w:val="12"/>
-  </w:num>
-  <w:num w:numId="25" w16cid:durableId="375929399">
-    <w:abstractNumId w:val="17"/>
-  </w:num>
-  <w:num w:numId="26" w16cid:durableId="1628269296">
-    <w:abstractNumId w:val="3"/>
-  </w:num>
-  <w:num w:numId="27" w16cid:durableId="1989554593">
-    <w:abstractNumId w:val="16"/>
-  </w:num>
-  <w:num w:numId="28" w16cid:durableId="453328799">
-    <w:abstractNumId w:val="5"/>
+  <w:num w:numId="38" w16cid:durableId="1277785186">
+    <w:abstractNumId w:val="26"/>
   </w:num>
 </w:numbering>
 </file>

</xml_diff>